<commit_message>
Corrige acentuacao no Word processo_substituicao_condenacao_ativos_glpi
</commit_message>
<xml_diff>
--- a/documentações/Processos/docx/processo_substituicao_condenacao_ativos_glpi.docx
+++ b/documentações/Processos/docx/processo_substituicao_condenacao_ativos_glpi.docx
@@ -41,7 +41,7 @@
           <w:color w:val="5E6B78"/>
           <w:sz w:val="19"/>
         </w:rPr>
-        <w:t>Ãrea responsÃ¡vel e versÃ£o conforme documentaÃ§Ã£o institucional</w:t>
+        <w:t>Área responsável e versão conforme documentação institucional</w:t>
       </w:r>
     </w:p>
     <w:p>
@@ -4970,6 +4970,8 @@
     <w:sectPr>
       <w:headerReference w:type="default" r:id="rId9"/>
       <w:footerReference w:type="default" r:id="rId10"/>
+      <w:headerReference w:type="first" r:id="rId11"/>
+      <w:footerReference w:type="first" r:id="rId12"/>
       <w:pgSz w:w="12240" w:h="15840"/>
       <w:pgMar w:top="1080" w:right="1123" w:bottom="1080" w:left="1123" w:header="504" w:footer="504" w:gutter="0"/>
       <w:cols w:space="720"/>
@@ -4992,7 +4994,7 @@
         <w:color w:val="5E6B78"/>
         <w:sz w:val="17"/>
       </w:rPr>
-      <w:t xml:space="preserve">Secretaria de SaÃºde do Recife  |  </w:t>
+      <w:t xml:space="preserve">Secretaria de Saúde do Recife  |  </w:t>
     </w:r>
     <w:r>
       <w:rPr>
@@ -5000,9 +5002,19 @@
         <w:color w:val="5E6B78"/>
         <w:sz w:val="18"/>
       </w:rPr>
-      <w:t xml:space="preserve">PÃ¡gina </w:t>
+      <w:t xml:space="preserve">Página </w:t>
     </w:r>
     <w:fldSimple w:instr="PAGE"/>
+  </w:p>
+</w:ftr>
+</file>
+
+<file path=word/footer2.xml><?xml version="1.0" encoding="utf-8"?>
+<w:ftr xmlns:m="http://schemas.openxmlformats.org/officeDocument/2006/math" xmlns:mc="http://schemas.openxmlformats.org/markup-compatibility/2006" xmlns:mo="http://schemas.microsoft.com/office/mac/office/2008/main" xmlns:mv="urn:schemas-microsoft-com:mac:vml" xmlns:o="urn:schemas-microsoft-com:office:office" xmlns:r="http://schemas.openxmlformats.org/officeDocument/2006/relationships" xmlns:v="urn:schemas-microsoft-com:vml" xmlns:w10="urn:schemas-microsoft-com:office:word" xmlns:w14="http://schemas.microsoft.com/office/word/2010/wordml" xmlns:w="http://schemas.openxmlformats.org/wordprocessingml/2006/main" xmlns:wne="http://schemas.microsoft.com/office/word/2006/wordml" xmlns:wp14="http://schemas.microsoft.com/office/word/2010/wordprocessingDrawing" xmlns:wp="http://schemas.openxmlformats.org/drawingml/2006/wordprocessingDrawing" xmlns:wpc="http://schemas.microsoft.com/office/word/2010/wordprocessingCanvas" xmlns:wpg="http://schemas.microsoft.com/office/word/2010/wordprocessingGroup" xmlns:wpi="http://schemas.microsoft.com/office/word/2010/wordprocessingInk" xmlns:wps="http://schemas.microsoft.com/office/word/2010/wordprocessingShape" mc:Ignorable="w14 wp14">
+  <w:p>
+    <w:pPr>
+      <w:pStyle w:val="Footer"/>
+    </w:pPr>
   </w:p>
 </w:ftr>
 </file>
@@ -5021,8 +5033,18 @@
         <w:color w:val="5E6B78"/>
         <w:sz w:val="17"/>
       </w:rPr>
-      <w:t>SAÃšDE DIGITAL ATENDE  |  PROCESSO OPERACIONAL</w:t>
+      <w:t>SAÚDE DIGITAL ATENDE  |  PROCESSO OPERACIONAL</w:t>
     </w:r>
+  </w:p>
+</w:hdr>
+</file>
+
+<file path=word/header2.xml><?xml version="1.0" encoding="utf-8"?>
+<w:hdr xmlns:m="http://schemas.openxmlformats.org/officeDocument/2006/math" xmlns:mc="http://schemas.openxmlformats.org/markup-compatibility/2006" xmlns:mo="http://schemas.microsoft.com/office/mac/office/2008/main" xmlns:mv="urn:schemas-microsoft-com:mac:vml" xmlns:o="urn:schemas-microsoft-com:office:office" xmlns:r="http://schemas.openxmlformats.org/officeDocument/2006/relationships" xmlns:v="urn:schemas-microsoft-com:vml" xmlns:w10="urn:schemas-microsoft-com:office:word" xmlns:w14="http://schemas.microsoft.com/office/word/2010/wordml" xmlns:w="http://schemas.openxmlformats.org/wordprocessingml/2006/main" xmlns:wne="http://schemas.microsoft.com/office/word/2006/wordml" xmlns:wp14="http://schemas.microsoft.com/office/word/2010/wordprocessingDrawing" xmlns:wp="http://schemas.openxmlformats.org/drawingml/2006/wordprocessingDrawing" xmlns:wpc="http://schemas.microsoft.com/office/word/2010/wordprocessingCanvas" xmlns:wpg="http://schemas.microsoft.com/office/word/2010/wordprocessingGroup" xmlns:wpi="http://schemas.microsoft.com/office/word/2010/wordprocessingInk" xmlns:wps="http://schemas.microsoft.com/office/word/2010/wordprocessingShape" mc:Ignorable="w14 wp14">
+  <w:p>
+    <w:pPr>
+      <w:pStyle w:val="Header"/>
+    </w:pPr>
   </w:p>
 </w:hdr>
 </file>

</xml_diff>

<commit_message>
Atualiza Word com fluxo de condenacao antes da substituicao
</commit_message>
<xml_diff>
--- a/documentações/Processos/docx/processo_substituicao_condenacao_ativos_glpi.docx
+++ b/documentações/Processos/docx/processo_substituicao_condenacao_ativos_glpi.docx
@@ -359,7 +359,7 @@
                 <w:rFonts w:ascii="Arial" w:hAnsi="Arial"/>
                 <w:sz w:val="18"/>
               </w:rPr>
-              <w:t>1.0</w:t>
+              <w:t>1.1</w:t>
             </w:r>
           </w:p>
         </w:tc>
@@ -900,7 +900,7 @@
         <w:spacing w:after="80"/>
       </w:pPr>
       <w:r>
-        <w:t>2. Diagnosticar O Técnico N2 executa o atendimento e registra se o ativo foi condenado.</w:t>
+        <w:t>2. Diagnosticar O Técnico N2 executa o atendimento e confirma tecnicamente a condenação.</w:t>
       </w:r>
     </w:p>
     <w:p>
@@ -908,7 +908,7 @@
         <w:spacing w:after="80"/>
       </w:pPr>
       <w:r>
-        <w:t>3. Substituir É aberto um novo chamado de substituição, relacionado ao anterior e com o ativo associado.</w:t>
+        <w:t>3. Condenar o ativo O cadastro do equipamento recebe status Condenado no GLPI e permanece disponível para rastreabilidade.</w:t>
       </w:r>
     </w:p>
     <w:p>
@@ -916,7 +916,7 @@
         <w:spacing w:after="80"/>
       </w:pPr>
       <w:r>
-        <w:t>4. Atualizar o inventário O ativo substituído recebe status Condenado e permanece no GLPI para rastreabilidade.</w:t>
+        <w:t>4. Abrir a substituição O Administrativo é consultado sobre disponibilidade; o chamado é aberto em qualquer cenário e mantido como Pendente.</w:t>
       </w:r>
     </w:p>
     <w:p>
@@ -2388,7 +2388,7 @@
                 <w:rFonts w:ascii="Arial" w:hAnsi="Arial"/>
                 <w:sz w:val="17"/>
               </w:rPr>
-              <w:t>O chamado encerrado será associado ao novo chamado de substituição no Processo 3.</w:t>
+              <w:t>O chamado encerrado será associado ao novo chamado de substituição no Processo 4.</w:t>
             </w:r>
           </w:p>
         </w:tc>
@@ -2415,954 +2415,7 @@
         <w:pStyle w:val="Heading1"/>
       </w:pPr>
       <w:r>
-        <w:t>Processo 3 Abrir Novo Chamado de Substituição</w:t>
-      </w:r>
-    </w:p>
-    <w:p>
-      <w:pPr>
-        <w:spacing w:after="80"/>
-      </w:pPr>
-      <w:r>
-        <w:rPr>
-          <w:color w:val="163A63"/>
-        </w:rPr>
-        <w:t>Pré-condição de estoque: todos os ativos disponíveis em estoque devem estar previamente incluídos no GLPI, conforme o processo de inventariar ativo. Antes de escolher o substituto, o Técnico N2 Suporte deve consultar a planilha de controle de ativos ou validar com o setor Administrativo quais equipamentos estão em estoque e podem ser utilizados para substituição.</w:t>
-      </w:r>
-    </w:p>
-    <w:tbl>
-      <w:tblPr>
-        <w:tblStyle w:val="TableGrid"/>
-        <w:tblW w:type="auto" w:w="0"/>
-        <w:jc w:val="center"/>
-        <w:tblLayout w:type="fixed"/>
-        <w:tblLook w:firstColumn="1" w:firstRow="1" w:lastColumn="0" w:lastRow="0" w:noHBand="0" w:noVBand="1" w:val="04A0"/>
-      </w:tblPr>
-      <w:tblGrid>
-        <w:gridCol w:w="700"/>
-        <w:gridCol w:w="4300"/>
-        <w:gridCol w:w="1700"/>
-        <w:gridCol w:w="2660"/>
-      </w:tblGrid>
-      <w:tr>
-        <w:trPr>
-          <w:tblHeader w:val="true"/>
-        </w:trPr>
-        <w:tc>
-          <w:tcPr>
-            <w:tcW w:type="dxa" w:w="700"/>
-            <w:tcMar>
-              <w:top w:w="90" w:type="dxa"/>
-              <w:start w:w="120" w:type="dxa"/>
-              <w:bottom w:w="90" w:type="dxa"/>
-              <w:end w:w="120" w:type="dxa"/>
-            </w:tcMar>
-            <w:vAlign w:val="center"/>
-            <w:shd w:fill="EAF2F8"/>
-          </w:tcPr>
-          <w:p>
-            <w:pPr>
-              <w:spacing w:after="0"/>
-            </w:pPr>
-            <w:r>
-              <w:rPr>
-                <w:rFonts w:ascii="Arial" w:hAnsi="Arial"/>
-                <w:b/>
-                <w:color w:val="163A63"/>
-                <w:sz w:val="17"/>
-              </w:rPr>
-              <w:t>N°</w:t>
-            </w:r>
-          </w:p>
-        </w:tc>
-        <w:tc>
-          <w:tcPr>
-            <w:tcW w:type="dxa" w:w="4300"/>
-            <w:tcMar>
-              <w:top w:w="90" w:type="dxa"/>
-              <w:start w:w="120" w:type="dxa"/>
-              <w:bottom w:w="90" w:type="dxa"/>
-              <w:end w:w="120" w:type="dxa"/>
-            </w:tcMar>
-            <w:vAlign w:val="center"/>
-            <w:shd w:fill="EAF2F8"/>
-          </w:tcPr>
-          <w:p>
-            <w:pPr>
-              <w:spacing w:after="0"/>
-            </w:pPr>
-            <w:r>
-              <w:rPr>
-                <w:rFonts w:ascii="Arial" w:hAnsi="Arial"/>
-                <w:b/>
-                <w:color w:val="163A63"/>
-                <w:sz w:val="17"/>
-              </w:rPr>
-              <w:t>Ação / Descrição</w:t>
-            </w:r>
-          </w:p>
-        </w:tc>
-        <w:tc>
-          <w:tcPr>
-            <w:tcW w:type="dxa" w:w="1700"/>
-            <w:tcMar>
-              <w:top w:w="90" w:type="dxa"/>
-              <w:start w:w="120" w:type="dxa"/>
-              <w:bottom w:w="90" w:type="dxa"/>
-              <w:end w:w="120" w:type="dxa"/>
-            </w:tcMar>
-            <w:vAlign w:val="center"/>
-            <w:shd w:fill="EAF2F8"/>
-          </w:tcPr>
-          <w:p>
-            <w:pPr>
-              <w:spacing w:after="0"/>
-            </w:pPr>
-            <w:r>
-              <w:rPr>
-                <w:rFonts w:ascii="Arial" w:hAnsi="Arial"/>
-                <w:b/>
-                <w:color w:val="163A63"/>
-                <w:sz w:val="17"/>
-              </w:rPr>
-              <w:t>Responsável</w:t>
-            </w:r>
-          </w:p>
-        </w:tc>
-        <w:tc>
-          <w:tcPr>
-            <w:tcW w:type="dxa" w:w="2660"/>
-            <w:tcMar>
-              <w:top w:w="90" w:type="dxa"/>
-              <w:start w:w="120" w:type="dxa"/>
-              <w:bottom w:w="90" w:type="dxa"/>
-              <w:end w:w="120" w:type="dxa"/>
-            </w:tcMar>
-            <w:vAlign w:val="center"/>
-            <w:shd w:fill="EAF2F8"/>
-          </w:tcPr>
-          <w:p>
-            <w:pPr>
-              <w:spacing w:after="0"/>
-            </w:pPr>
-            <w:r>
-              <w:rPr>
-                <w:rFonts w:ascii="Arial" w:hAnsi="Arial"/>
-                <w:b/>
-                <w:color w:val="163A63"/>
-                <w:sz w:val="17"/>
-              </w:rPr>
-              <w:t>Observação</w:t>
-            </w:r>
-          </w:p>
-        </w:tc>
-      </w:tr>
-      <w:tr>
-        <w:tc>
-          <w:tcPr>
-            <w:tcW w:type="dxa" w:w="700"/>
-            <w:tcMar>
-              <w:top w:w="90" w:type="dxa"/>
-              <w:start w:w="120" w:type="dxa"/>
-              <w:bottom w:w="90" w:type="dxa"/>
-              <w:end w:w="120" w:type="dxa"/>
-            </w:tcMar>
-            <w:vAlign w:val="center"/>
-          </w:tcPr>
-          <w:p>
-            <w:pPr>
-              <w:spacing w:after="0"/>
-            </w:pPr>
-            <w:r>
-              <w:rPr>
-                <w:rFonts w:ascii="Arial" w:hAnsi="Arial"/>
-                <w:sz w:val="17"/>
-              </w:rPr>
-              <w:t>1</w:t>
-            </w:r>
-          </w:p>
-        </w:tc>
-        <w:tc>
-          <w:tcPr>
-            <w:tcW w:type="dxa" w:w="4300"/>
-            <w:tcMar>
-              <w:top w:w="90" w:type="dxa"/>
-              <w:start w:w="120" w:type="dxa"/>
-              <w:bottom w:w="90" w:type="dxa"/>
-              <w:end w:w="120" w:type="dxa"/>
-            </w:tcMar>
-            <w:vAlign w:val="center"/>
-          </w:tcPr>
-          <w:p>
-            <w:pPr>
-              <w:spacing w:after="0"/>
-            </w:pPr>
-            <w:r>
-              <w:rPr>
-                <w:rFonts w:ascii="Arial" w:hAnsi="Arial"/>
-                <w:sz w:val="17"/>
-              </w:rPr>
-              <w:t>Verificar na planilha de controle de ativos quais equipamentos estão em estoque e podem ser utilizados para substituição.</w:t>
-            </w:r>
-          </w:p>
-        </w:tc>
-        <w:tc>
-          <w:tcPr>
-            <w:tcW w:type="dxa" w:w="1700"/>
-            <w:tcMar>
-              <w:top w:w="90" w:type="dxa"/>
-              <w:start w:w="120" w:type="dxa"/>
-              <w:bottom w:w="90" w:type="dxa"/>
-              <w:end w:w="120" w:type="dxa"/>
-            </w:tcMar>
-            <w:vAlign w:val="center"/>
-          </w:tcPr>
-          <w:p>
-            <w:pPr>
-              <w:spacing w:after="0"/>
-            </w:pPr>
-            <w:r>
-              <w:rPr>
-                <w:rFonts w:ascii="Arial" w:hAnsi="Arial"/>
-                <w:sz w:val="17"/>
-              </w:rPr>
-              <w:t>Técnico N2 Suporte / Administrativo</w:t>
-            </w:r>
-          </w:p>
-        </w:tc>
-        <w:tc>
-          <w:tcPr>
-            <w:tcW w:type="dxa" w:w="2660"/>
-            <w:tcMar>
-              <w:top w:w="90" w:type="dxa"/>
-              <w:start w:w="120" w:type="dxa"/>
-              <w:bottom w:w="90" w:type="dxa"/>
-              <w:end w:w="120" w:type="dxa"/>
-            </w:tcMar>
-            <w:vAlign w:val="center"/>
-          </w:tcPr>
-          <w:p>
-            <w:pPr>
-              <w:spacing w:after="0"/>
-            </w:pPr>
-            <w:r>
-              <w:rPr>
-                <w:rFonts w:ascii="Arial" w:hAnsi="Arial"/>
-                <w:sz w:val="17"/>
-              </w:rPr>
-              <w:t>Validar disponibilidade antes de abrir o novo chamado.</w:t>
-            </w:r>
-          </w:p>
-        </w:tc>
-      </w:tr>
-      <w:tr>
-        <w:tc>
-          <w:tcPr>
-            <w:tcW w:type="dxa" w:w="700"/>
-            <w:tcMar>
-              <w:top w:w="90" w:type="dxa"/>
-              <w:start w:w="120" w:type="dxa"/>
-              <w:bottom w:w="90" w:type="dxa"/>
-              <w:end w:w="120" w:type="dxa"/>
-            </w:tcMar>
-            <w:vAlign w:val="center"/>
-          </w:tcPr>
-          <w:p>
-            <w:pPr>
-              <w:spacing w:after="0"/>
-            </w:pPr>
-            <w:r>
-              <w:rPr>
-                <w:rFonts w:ascii="Arial" w:hAnsi="Arial"/>
-                <w:sz w:val="17"/>
-              </w:rPr>
-              <w:t>2</w:t>
-            </w:r>
-          </w:p>
-        </w:tc>
-        <w:tc>
-          <w:tcPr>
-            <w:tcW w:type="dxa" w:w="4300"/>
-            <w:tcMar>
-              <w:top w:w="90" w:type="dxa"/>
-              <w:start w:w="120" w:type="dxa"/>
-              <w:bottom w:w="90" w:type="dxa"/>
-              <w:end w:w="120" w:type="dxa"/>
-            </w:tcMar>
-            <w:vAlign w:val="center"/>
-          </w:tcPr>
-          <w:p>
-            <w:pPr>
-              <w:spacing w:after="0"/>
-            </w:pPr>
-            <w:r>
-              <w:rPr>
-                <w:rFonts w:ascii="Arial" w:hAnsi="Arial"/>
-                <w:sz w:val="17"/>
-              </w:rPr>
-              <w:t>Confirmar que o ativo substituto escolhido já está cadastrado no GLPI e apto para uso.</w:t>
-            </w:r>
-          </w:p>
-        </w:tc>
-        <w:tc>
-          <w:tcPr>
-            <w:tcW w:type="dxa" w:w="1700"/>
-            <w:tcMar>
-              <w:top w:w="90" w:type="dxa"/>
-              <w:start w:w="120" w:type="dxa"/>
-              <w:bottom w:w="90" w:type="dxa"/>
-              <w:end w:w="120" w:type="dxa"/>
-            </w:tcMar>
-            <w:vAlign w:val="center"/>
-          </w:tcPr>
-          <w:p>
-            <w:pPr>
-              <w:spacing w:after="0"/>
-            </w:pPr>
-            <w:r>
-              <w:rPr>
-                <w:rFonts w:ascii="Arial" w:hAnsi="Arial"/>
-                <w:sz w:val="17"/>
-              </w:rPr>
-              <w:t>Técnico N2 Suporte</w:t>
-            </w:r>
-          </w:p>
-        </w:tc>
-        <w:tc>
-          <w:tcPr>
-            <w:tcW w:type="dxa" w:w="2660"/>
-            <w:tcMar>
-              <w:top w:w="90" w:type="dxa"/>
-              <w:start w:w="120" w:type="dxa"/>
-              <w:bottom w:w="90" w:type="dxa"/>
-              <w:end w:w="120" w:type="dxa"/>
-            </w:tcMar>
-            <w:vAlign w:val="center"/>
-          </w:tcPr>
-          <w:p>
-            <w:pPr>
-              <w:spacing w:after="0"/>
-            </w:pPr>
-            <w:r>
-              <w:rPr>
-                <w:rFonts w:ascii="Arial" w:hAnsi="Arial"/>
-                <w:sz w:val="17"/>
-              </w:rPr>
-              <w:t>Caso não esteja cadastrado, seguir primeiro o processo de inventariar ativo.</w:t>
-            </w:r>
-          </w:p>
-        </w:tc>
-      </w:tr>
-      <w:tr>
-        <w:tc>
-          <w:tcPr>
-            <w:tcW w:type="dxa" w:w="700"/>
-            <w:tcMar>
-              <w:top w:w="90" w:type="dxa"/>
-              <w:start w:w="120" w:type="dxa"/>
-              <w:bottom w:w="90" w:type="dxa"/>
-              <w:end w:w="120" w:type="dxa"/>
-            </w:tcMar>
-            <w:vAlign w:val="center"/>
-          </w:tcPr>
-          <w:p>
-            <w:pPr>
-              <w:spacing w:after="0"/>
-            </w:pPr>
-            <w:r>
-              <w:rPr>
-                <w:rFonts w:ascii="Arial" w:hAnsi="Arial"/>
-                <w:sz w:val="17"/>
-              </w:rPr>
-              <w:t>3</w:t>
-            </w:r>
-          </w:p>
-        </w:tc>
-        <w:tc>
-          <w:tcPr>
-            <w:tcW w:type="dxa" w:w="4300"/>
-            <w:tcMar>
-              <w:top w:w="90" w:type="dxa"/>
-              <w:start w:w="120" w:type="dxa"/>
-              <w:bottom w:w="90" w:type="dxa"/>
-              <w:end w:w="120" w:type="dxa"/>
-            </w:tcMar>
-            <w:vAlign w:val="center"/>
-          </w:tcPr>
-          <w:p>
-            <w:pPr>
-              <w:spacing w:after="0"/>
-            </w:pPr>
-            <w:r>
-              <w:rPr>
-                <w:rFonts w:ascii="Arial" w:hAnsi="Arial"/>
-                <w:sz w:val="17"/>
-              </w:rPr>
-              <w:t>Localizar o chamado encerrado anteriormente e usar seus dados para abrir um novo chamado no GLPI com categorização de Substituição , conforme o catálogo de serviços.</w:t>
-            </w:r>
-          </w:p>
-        </w:tc>
-        <w:tc>
-          <w:tcPr>
-            <w:tcW w:type="dxa" w:w="1700"/>
-            <w:tcMar>
-              <w:top w:w="90" w:type="dxa"/>
-              <w:start w:w="120" w:type="dxa"/>
-              <w:bottom w:w="90" w:type="dxa"/>
-              <w:end w:w="120" w:type="dxa"/>
-            </w:tcMar>
-            <w:vAlign w:val="center"/>
-          </w:tcPr>
-          <w:p>
-            <w:pPr>
-              <w:spacing w:after="0"/>
-            </w:pPr>
-            <w:r>
-              <w:rPr>
-                <w:rFonts w:ascii="Arial" w:hAnsi="Arial"/>
-                <w:sz w:val="17"/>
-              </w:rPr>
-              <w:t>Técnico N2 Suporte</w:t>
-            </w:r>
-          </w:p>
-        </w:tc>
-        <w:tc>
-          <w:tcPr>
-            <w:tcW w:type="dxa" w:w="2660"/>
-            <w:tcMar>
-              <w:top w:w="90" w:type="dxa"/>
-              <w:start w:w="120" w:type="dxa"/>
-              <w:bottom w:w="90" w:type="dxa"/>
-              <w:end w:w="120" w:type="dxa"/>
-            </w:tcMar>
-            <w:vAlign w:val="center"/>
-          </w:tcPr>
-          <w:p>
-            <w:pPr>
-              <w:spacing w:after="0"/>
-            </w:pPr>
-            <w:r>
-              <w:rPr>
-                <w:rFonts w:ascii="Arial" w:hAnsi="Arial"/>
-                <w:sz w:val="17"/>
-              </w:rPr>
-              <w:t>Reaproveitar os dados do usuário, e-mail, unidade, setor e demais informações do chamado encerrado.</w:t>
-            </w:r>
-          </w:p>
-        </w:tc>
-      </w:tr>
-      <w:tr>
-        <w:tc>
-          <w:tcPr>
-            <w:tcW w:type="dxa" w:w="700"/>
-            <w:tcMar>
-              <w:top w:w="90" w:type="dxa"/>
-              <w:start w:w="120" w:type="dxa"/>
-              <w:bottom w:w="90" w:type="dxa"/>
-              <w:end w:w="120" w:type="dxa"/>
-            </w:tcMar>
-            <w:vAlign w:val="center"/>
-          </w:tcPr>
-          <w:p>
-            <w:pPr>
-              <w:spacing w:after="0"/>
-            </w:pPr>
-            <w:r>
-              <w:rPr>
-                <w:rFonts w:ascii="Arial" w:hAnsi="Arial"/>
-                <w:sz w:val="17"/>
-              </w:rPr>
-              <w:t>4</w:t>
-            </w:r>
-          </w:p>
-        </w:tc>
-        <w:tc>
-          <w:tcPr>
-            <w:tcW w:type="dxa" w:w="4300"/>
-            <w:tcMar>
-              <w:top w:w="90" w:type="dxa"/>
-              <w:start w:w="120" w:type="dxa"/>
-              <w:bottom w:w="90" w:type="dxa"/>
-              <w:end w:w="120" w:type="dxa"/>
-            </w:tcMar>
-            <w:vAlign w:val="center"/>
-          </w:tcPr>
-          <w:p>
-            <w:pPr>
-              <w:spacing w:after="0"/>
-            </w:pPr>
-            <w:r>
-              <w:rPr>
-                <w:rFonts w:ascii="Arial" w:hAnsi="Arial"/>
-                <w:sz w:val="17"/>
-              </w:rPr>
-              <w:t>Na descrição do novo chamado, informar obrigatoriamente o ativo substituído, o responsável pelo ativo, e-mail do usuário, unidade, setor, número patrimonial e motivo da substituição.</w:t>
-            </w:r>
-          </w:p>
-        </w:tc>
-        <w:tc>
-          <w:tcPr>
-            <w:tcW w:type="dxa" w:w="1700"/>
-            <w:tcMar>
-              <w:top w:w="90" w:type="dxa"/>
-              <w:start w:w="120" w:type="dxa"/>
-              <w:bottom w:w="90" w:type="dxa"/>
-              <w:end w:w="120" w:type="dxa"/>
-            </w:tcMar>
-            <w:vAlign w:val="center"/>
-          </w:tcPr>
-          <w:p>
-            <w:pPr>
-              <w:spacing w:after="0"/>
-            </w:pPr>
-            <w:r>
-              <w:rPr>
-                <w:rFonts w:ascii="Arial" w:hAnsi="Arial"/>
-                <w:sz w:val="17"/>
-              </w:rPr>
-              <w:t>Técnico N2 Suporte</w:t>
-            </w:r>
-          </w:p>
-        </w:tc>
-        <w:tc>
-          <w:tcPr>
-            <w:tcW w:type="dxa" w:w="2660"/>
-            <w:tcMar>
-              <w:top w:w="90" w:type="dxa"/>
-              <w:start w:w="120" w:type="dxa"/>
-              <w:bottom w:w="90" w:type="dxa"/>
-              <w:end w:w="120" w:type="dxa"/>
-            </w:tcMar>
-            <w:vAlign w:val="center"/>
-          </w:tcPr>
-          <w:p>
-            <w:pPr>
-              <w:spacing w:after="0"/>
-            </w:pPr>
-            <w:r>
-              <w:rPr>
-                <w:rFonts w:ascii="Arial" w:hAnsi="Arial"/>
-                <w:sz w:val="17"/>
-              </w:rPr>
-              <w:t>Essas informações devem ser conferidas a partir do chamado encerrado anteriormente.</w:t>
-            </w:r>
-          </w:p>
-        </w:tc>
-      </w:tr>
-      <w:tr>
-        <w:tc>
-          <w:tcPr>
-            <w:tcW w:type="dxa" w:w="700"/>
-            <w:tcMar>
-              <w:top w:w="90" w:type="dxa"/>
-              <w:start w:w="120" w:type="dxa"/>
-              <w:bottom w:w="90" w:type="dxa"/>
-              <w:end w:w="120" w:type="dxa"/>
-            </w:tcMar>
-            <w:vAlign w:val="center"/>
-          </w:tcPr>
-          <w:p>
-            <w:pPr>
-              <w:spacing w:after="0"/>
-            </w:pPr>
-            <w:r>
-              <w:rPr>
-                <w:rFonts w:ascii="Arial" w:hAnsi="Arial"/>
-                <w:sz w:val="17"/>
-              </w:rPr>
-              <w:t>5</w:t>
-            </w:r>
-          </w:p>
-        </w:tc>
-        <w:tc>
-          <w:tcPr>
-            <w:tcW w:type="dxa" w:w="4300"/>
-            <w:tcMar>
-              <w:top w:w="90" w:type="dxa"/>
-              <w:start w:w="120" w:type="dxa"/>
-              <w:bottom w:w="90" w:type="dxa"/>
-              <w:end w:w="120" w:type="dxa"/>
-            </w:tcMar>
-            <w:vAlign w:val="center"/>
-          </w:tcPr>
-          <w:p>
-            <w:pPr>
-              <w:spacing w:after="0"/>
-            </w:pPr>
-            <w:r>
-              <w:rPr>
-                <w:rFonts w:ascii="Arial" w:hAnsi="Arial"/>
-                <w:sz w:val="17"/>
-              </w:rPr>
-              <w:t>Localizar o chamado encerrado anteriormente, que recebeu o diagnóstico de Patrimônio, e associá-lo ao novo chamado de substituição.</w:t>
-            </w:r>
-          </w:p>
-        </w:tc>
-        <w:tc>
-          <w:tcPr>
-            <w:tcW w:type="dxa" w:w="1700"/>
-            <w:tcMar>
-              <w:top w:w="90" w:type="dxa"/>
-              <w:start w:w="120" w:type="dxa"/>
-              <w:bottom w:w="90" w:type="dxa"/>
-              <w:end w:w="120" w:type="dxa"/>
-            </w:tcMar>
-            <w:vAlign w:val="center"/>
-          </w:tcPr>
-          <w:p>
-            <w:pPr>
-              <w:spacing w:after="0"/>
-            </w:pPr>
-            <w:r>
-              <w:rPr>
-                <w:rFonts w:ascii="Arial" w:hAnsi="Arial"/>
-                <w:sz w:val="17"/>
-              </w:rPr>
-              <w:t>Técnico N2 Suporte</w:t>
-            </w:r>
-          </w:p>
-        </w:tc>
-        <w:tc>
-          <w:tcPr>
-            <w:tcW w:type="dxa" w:w="2660"/>
-            <w:tcMar>
-              <w:top w:w="90" w:type="dxa"/>
-              <w:start w:w="120" w:type="dxa"/>
-              <w:bottom w:w="90" w:type="dxa"/>
-              <w:end w:w="120" w:type="dxa"/>
-            </w:tcMar>
-            <w:vAlign w:val="center"/>
-          </w:tcPr>
-          <w:p>
-            <w:pPr>
-              <w:spacing w:after="0"/>
-            </w:pPr>
-            <w:r>
-              <w:rPr>
-                <w:rFonts w:ascii="Arial" w:hAnsi="Arial"/>
-                <w:sz w:val="17"/>
-              </w:rPr>
-              <w:t>O chamado encerrado é a evidência do diagnóstico técnico.</w:t>
-            </w:r>
-          </w:p>
-        </w:tc>
-      </w:tr>
-      <w:tr>
-        <w:tc>
-          <w:tcPr>
-            <w:tcW w:type="dxa" w:w="700"/>
-            <w:tcMar>
-              <w:top w:w="90" w:type="dxa"/>
-              <w:start w:w="120" w:type="dxa"/>
-              <w:bottom w:w="90" w:type="dxa"/>
-              <w:end w:w="120" w:type="dxa"/>
-            </w:tcMar>
-            <w:vAlign w:val="center"/>
-          </w:tcPr>
-          <w:p>
-            <w:pPr>
-              <w:spacing w:after="0"/>
-            </w:pPr>
-            <w:r>
-              <w:rPr>
-                <w:rFonts w:ascii="Arial" w:hAnsi="Arial"/>
-                <w:sz w:val="17"/>
-              </w:rPr>
-              <w:t>6</w:t>
-            </w:r>
-          </w:p>
-        </w:tc>
-        <w:tc>
-          <w:tcPr>
-            <w:tcW w:type="dxa" w:w="4300"/>
-            <w:tcMar>
-              <w:top w:w="90" w:type="dxa"/>
-              <w:start w:w="120" w:type="dxa"/>
-              <w:bottom w:w="90" w:type="dxa"/>
-              <w:end w:w="120" w:type="dxa"/>
-            </w:tcMar>
-            <w:vAlign w:val="center"/>
-          </w:tcPr>
-          <w:p>
-            <w:pPr>
-              <w:spacing w:after="0"/>
-            </w:pPr>
-            <w:r>
-              <w:rPr>
-                <w:rFonts w:ascii="Arial" w:hAnsi="Arial"/>
-                <w:sz w:val="17"/>
-              </w:rPr>
-              <w:t>Na aba "Itens" do novo chamado, clicar em "+ Adicionar item" e associar qual ativo será substituído.</w:t>
-            </w:r>
-          </w:p>
-        </w:tc>
-        <w:tc>
-          <w:tcPr>
-            <w:tcW w:type="dxa" w:w="1700"/>
-            <w:tcMar>
-              <w:top w:w="90" w:type="dxa"/>
-              <w:start w:w="120" w:type="dxa"/>
-              <w:bottom w:w="90" w:type="dxa"/>
-              <w:end w:w="120" w:type="dxa"/>
-            </w:tcMar>
-            <w:vAlign w:val="center"/>
-          </w:tcPr>
-          <w:p>
-            <w:pPr>
-              <w:spacing w:after="0"/>
-            </w:pPr>
-            <w:r>
-              <w:rPr>
-                <w:rFonts w:ascii="Arial" w:hAnsi="Arial"/>
-                <w:sz w:val="17"/>
-              </w:rPr>
-              <w:t>Técnico N2 Suporte</w:t>
-            </w:r>
-          </w:p>
-        </w:tc>
-        <w:tc>
-          <w:tcPr>
-            <w:tcW w:type="dxa" w:w="2660"/>
-            <w:tcMar>
-              <w:top w:w="90" w:type="dxa"/>
-              <w:start w:w="120" w:type="dxa"/>
-              <w:bottom w:w="90" w:type="dxa"/>
-              <w:end w:w="120" w:type="dxa"/>
-            </w:tcMar>
-            <w:vAlign w:val="center"/>
-          </w:tcPr>
-          <w:p>
-            <w:pPr>
-              <w:spacing w:after="0"/>
-            </w:pPr>
-            <w:r>
-              <w:rPr>
-                <w:rFonts w:ascii="Arial" w:hAnsi="Arial"/>
-                <w:sz w:val="17"/>
-              </w:rPr>
-              <w:t>Associar o ativo condenado/substituído, não apenas citar na descrição.</w:t>
-            </w:r>
-          </w:p>
-        </w:tc>
-      </w:tr>
-      <w:tr>
-        <w:tc>
-          <w:tcPr>
-            <w:tcW w:type="dxa" w:w="700"/>
-            <w:tcMar>
-              <w:top w:w="90" w:type="dxa"/>
-              <w:start w:w="120" w:type="dxa"/>
-              <w:bottom w:w="90" w:type="dxa"/>
-              <w:end w:w="120" w:type="dxa"/>
-            </w:tcMar>
-            <w:vAlign w:val="center"/>
-          </w:tcPr>
-          <w:p>
-            <w:pPr>
-              <w:spacing w:after="0"/>
-            </w:pPr>
-            <w:r>
-              <w:rPr>
-                <w:rFonts w:ascii="Arial" w:hAnsi="Arial"/>
-                <w:sz w:val="17"/>
-              </w:rPr>
-              <w:t>7</w:t>
-            </w:r>
-          </w:p>
-        </w:tc>
-        <w:tc>
-          <w:tcPr>
-            <w:tcW w:type="dxa" w:w="4300"/>
-            <w:tcMar>
-              <w:top w:w="90" w:type="dxa"/>
-              <w:start w:w="120" w:type="dxa"/>
-              <w:bottom w:w="90" w:type="dxa"/>
-              <w:end w:w="120" w:type="dxa"/>
-            </w:tcMar>
-            <w:vAlign w:val="center"/>
-          </w:tcPr>
-          <w:p>
-            <w:pPr>
-              <w:spacing w:after="0"/>
-            </w:pPr>
-            <w:r>
-              <w:rPr>
-                <w:rFonts w:ascii="Arial" w:hAnsi="Arial"/>
-                <w:sz w:val="17"/>
-              </w:rPr>
-              <w:t>Registrar em acompanhamento o ativo substituto definido na planilha de controle de ativos e a validação do setor Administrativo.</w:t>
-            </w:r>
-          </w:p>
-        </w:tc>
-        <w:tc>
-          <w:tcPr>
-            <w:tcW w:type="dxa" w:w="1700"/>
-            <w:tcMar>
-              <w:top w:w="90" w:type="dxa"/>
-              <w:start w:w="120" w:type="dxa"/>
-              <w:bottom w:w="90" w:type="dxa"/>
-              <w:end w:w="120" w:type="dxa"/>
-            </w:tcMar>
-            <w:vAlign w:val="center"/>
-          </w:tcPr>
-          <w:p>
-            <w:pPr>
-              <w:spacing w:after="0"/>
-            </w:pPr>
-            <w:r>
-              <w:rPr>
-                <w:rFonts w:ascii="Arial" w:hAnsi="Arial"/>
-                <w:sz w:val="17"/>
-              </w:rPr>
-              <w:t>Técnico N2 Suporte / Administrativo</w:t>
-            </w:r>
-          </w:p>
-        </w:tc>
-        <w:tc>
-          <w:tcPr>
-            <w:tcW w:type="dxa" w:w="2660"/>
-            <w:tcMar>
-              <w:top w:w="90" w:type="dxa"/>
-              <w:start w:w="120" w:type="dxa"/>
-              <w:bottom w:w="90" w:type="dxa"/>
-              <w:end w:w="120" w:type="dxa"/>
-            </w:tcMar>
-            <w:vAlign w:val="center"/>
-          </w:tcPr>
-          <w:p>
-            <w:pPr>
-              <w:spacing w:after="0"/>
-            </w:pPr>
-            <w:r>
-              <w:rPr>
-                <w:rFonts w:ascii="Arial" w:hAnsi="Arial"/>
-                <w:sz w:val="17"/>
-              </w:rPr>
-              <w:t>Informar patrimônio, série ou identificação do equipamento substituto.</w:t>
-            </w:r>
-          </w:p>
-        </w:tc>
-      </w:tr>
-      <w:tr>
-        <w:tc>
-          <w:tcPr>
-            <w:tcW w:type="dxa" w:w="700"/>
-            <w:tcMar>
-              <w:top w:w="90" w:type="dxa"/>
-              <w:start w:w="120" w:type="dxa"/>
-              <w:bottom w:w="90" w:type="dxa"/>
-              <w:end w:w="120" w:type="dxa"/>
-            </w:tcMar>
-            <w:vAlign w:val="center"/>
-          </w:tcPr>
-          <w:p>
-            <w:pPr>
-              <w:spacing w:after="0"/>
-            </w:pPr>
-            <w:r>
-              <w:rPr>
-                <w:rFonts w:ascii="Arial" w:hAnsi="Arial"/>
-                <w:sz w:val="17"/>
-              </w:rPr>
-              <w:t>8</w:t>
-            </w:r>
-          </w:p>
-        </w:tc>
-        <w:tc>
-          <w:tcPr>
-            <w:tcW w:type="dxa" w:w="4300"/>
-            <w:tcMar>
-              <w:top w:w="90" w:type="dxa"/>
-              <w:start w:w="120" w:type="dxa"/>
-              <w:bottom w:w="90" w:type="dxa"/>
-              <w:end w:w="120" w:type="dxa"/>
-            </w:tcMar>
-            <w:vAlign w:val="center"/>
-          </w:tcPr>
-          <w:p>
-            <w:pPr>
-              <w:spacing w:after="0"/>
-            </w:pPr>
-            <w:r>
-              <w:rPr>
-                <w:rFonts w:ascii="Arial" w:hAnsi="Arial"/>
-                <w:sz w:val="17"/>
-              </w:rPr>
-              <w:t>Atribuir o chamado ao grupo responsável pela continuidade do processo de substituição, conforme catálogo de serviços.</w:t>
-            </w:r>
-          </w:p>
-        </w:tc>
-        <w:tc>
-          <w:tcPr>
-            <w:tcW w:type="dxa" w:w="1700"/>
-            <w:tcMar>
-              <w:top w:w="90" w:type="dxa"/>
-              <w:start w:w="120" w:type="dxa"/>
-              <w:bottom w:w="90" w:type="dxa"/>
-              <w:end w:w="120" w:type="dxa"/>
-            </w:tcMar>
-            <w:vAlign w:val="center"/>
-          </w:tcPr>
-          <w:p>
-            <w:pPr>
-              <w:spacing w:after="0"/>
-            </w:pPr>
-            <w:r>
-              <w:rPr>
-                <w:rFonts w:ascii="Arial" w:hAnsi="Arial"/>
-                <w:sz w:val="17"/>
-              </w:rPr>
-              <w:t>Técnico N2 Suporte</w:t>
-            </w:r>
-          </w:p>
-        </w:tc>
-        <w:tc>
-          <w:tcPr>
-            <w:tcW w:type="dxa" w:w="2660"/>
-            <w:tcMar>
-              <w:top w:w="90" w:type="dxa"/>
-              <w:start w:w="120" w:type="dxa"/>
-              <w:bottom w:w="90" w:type="dxa"/>
-              <w:end w:w="120" w:type="dxa"/>
-            </w:tcMar>
-            <w:vAlign w:val="center"/>
-          </w:tcPr>
-          <w:p>
-            <w:pPr>
-              <w:spacing w:after="0"/>
-            </w:pPr>
-            <w:r>
-              <w:rPr>
-                <w:rFonts w:ascii="Arial" w:hAnsi="Arial"/>
-                <w:sz w:val="17"/>
-              </w:rPr>
-              <w:t>Manter a associação com o chamado encerrado até a conclusão.</w:t>
-            </w:r>
-          </w:p>
-        </w:tc>
-      </w:tr>
-    </w:tbl>
-    <w:p>
-      <w:pPr>
-        <w:spacing w:after="40"/>
-      </w:pPr>
-    </w:p>
-    <w:p>
-      <w:pPr>
-        <w:spacing w:after="80"/>
-      </w:pPr>
-      <w:r>
-        <w:rPr>
-          <w:color w:val="163A63"/>
-        </w:rPr>
-        <w:t>⚠️ Registro obrigatório: O chamado de substituição DEVE conter o ativo substituído, o responsável pelo ativo, o ativo substituto definido, a associação com o chamado encerrado anteriormente e a categoria de Substituição conforme catálogo de serviços.</w:t>
-      </w:r>
-    </w:p>
-    <w:p>
-      <w:pPr>
-        <w:pStyle w:val="Heading1"/>
-      </w:pPr>
-      <w:r>
-        <w:t>Processo 4 Atualização do Ativo Condenado</w:t>
+        <w:t>Processo 3 Condenação do Ativo</w:t>
       </w:r>
     </w:p>
     <w:p>
@@ -3842,7 +2895,7 @@
                 <w:rFonts w:ascii="Arial" w:hAnsi="Arial"/>
                 <w:sz w:val="17"/>
               </w:rPr>
-              <w:t>Preencher Ativo Substituto , Data de Substituição , Data do Último Inventário e Inventariado , conforme os dados do atendimento e da planilha de controle de ativos.</w:t>
+              <w:t>Atualizar os dados de controle do ativo condenado, incluindo Data do Último Inventário e Inventariado , conforme as informações disponíveis no atendimento.</w:t>
             </w:r>
           </w:p>
         </w:tc>
@@ -3890,7 +2943,7 @@
                 <w:rFonts w:ascii="Arial" w:hAnsi="Arial"/>
                 <w:sz w:val="17"/>
               </w:rPr>
-              <w:t>O substituto deve estar cadastrado no GLPI; esses campos correspondem ao formulário exibido no cadastro do computador.</w:t>
+              <w:t>Neste momento ainda não é necessário definir ou preencher o ativo substituto.</w:t>
             </w:r>
           </w:p>
         </w:tc>
@@ -3940,7 +2993,7 @@
                 <w:rFonts w:ascii="Arial" w:hAnsi="Arial"/>
                 <w:sz w:val="17"/>
               </w:rPr>
-              <w:t>Salvar as alterações no ativo e registrar no chamado de substituição que o ativo enviado ao Patrimônio foi alterado para "Condenado".</w:t>
+              <w:t>Salvar as alterações no ativo e registrar no chamado técnico original que o equipamento foi alterado para o status "Condenado" .</w:t>
             </w:r>
           </w:p>
         </w:tc>
@@ -3988,7 +3041,7 @@
                 <w:rFonts w:ascii="Arial" w:hAnsi="Arial"/>
                 <w:sz w:val="17"/>
               </w:rPr>
-              <w:t>Informar o número patrimonial do ativo condenado e do ativo substituto.</w:t>
+              <w:t>Informar o número patrimonial do ativo condenado. A substituição será tratada no processo seguinte.</w:t>
             </w:r>
           </w:p>
         </w:tc>
@@ -4008,6 +3061,953 @@
           <w:color w:val="163A63"/>
         </w:rPr>
         <w:t>🔴 ATENÇÃO: O ativo condenado nunca deve ser removido do GLPI, em nenhuma hipótese — nem antes, nem depois da baixa patrimonial. Ele permanece cadastrado permanentemente com status "Condenado", para preservar o histórico e permitir auditoria a qualquer momento.</w:t>
+      </w:r>
+    </w:p>
+    <w:p>
+      <w:pPr>
+        <w:pStyle w:val="Heading1"/>
+      </w:pPr>
+      <w:r>
+        <w:t>Processo 4 Abertura do Chamado de Substituição</w:t>
+      </w:r>
+    </w:p>
+    <w:p>
+      <w:pPr>
+        <w:spacing w:after="80"/>
+      </w:pPr>
+      <w:r>
+        <w:rPr>
+          <w:color w:val="163A63"/>
+        </w:rPr>
+        <w:t>Consulta obrigatória ao Administrativo: antes de concluir o registro, o Técnico N2 Suporte deve verificar com o setor Administrativo se existe computador ou notebook disponível para substituição. Havendo ou não equipamento disponível, o chamado de substituição deve ser aberto e mantido com status Pendente até a continuidade do atendimento.</w:t>
+      </w:r>
+    </w:p>
+    <w:tbl>
+      <w:tblPr>
+        <w:tblStyle w:val="TableGrid"/>
+        <w:tblW w:type="auto" w:w="0"/>
+        <w:jc w:val="center"/>
+        <w:tblLayout w:type="fixed"/>
+        <w:tblLook w:firstColumn="1" w:firstRow="1" w:lastColumn="0" w:lastRow="0" w:noHBand="0" w:noVBand="1" w:val="04A0"/>
+      </w:tblPr>
+      <w:tblGrid>
+        <w:gridCol w:w="700"/>
+        <w:gridCol w:w="4300"/>
+        <w:gridCol w:w="1700"/>
+        <w:gridCol w:w="2660"/>
+      </w:tblGrid>
+      <w:tr>
+        <w:trPr>
+          <w:tblHeader w:val="true"/>
+        </w:trPr>
+        <w:tc>
+          <w:tcPr>
+            <w:tcW w:type="dxa" w:w="700"/>
+            <w:tcMar>
+              <w:top w:w="90" w:type="dxa"/>
+              <w:start w:w="120" w:type="dxa"/>
+              <w:bottom w:w="90" w:type="dxa"/>
+              <w:end w:w="120" w:type="dxa"/>
+            </w:tcMar>
+            <w:vAlign w:val="center"/>
+            <w:shd w:fill="EAF2F8"/>
+          </w:tcPr>
+          <w:p>
+            <w:pPr>
+              <w:spacing w:after="0"/>
+            </w:pPr>
+            <w:r>
+              <w:rPr>
+                <w:rFonts w:ascii="Arial" w:hAnsi="Arial"/>
+                <w:b/>
+                <w:color w:val="163A63"/>
+                <w:sz w:val="17"/>
+              </w:rPr>
+              <w:t>N°</w:t>
+            </w:r>
+          </w:p>
+        </w:tc>
+        <w:tc>
+          <w:tcPr>
+            <w:tcW w:type="dxa" w:w="4300"/>
+            <w:tcMar>
+              <w:top w:w="90" w:type="dxa"/>
+              <w:start w:w="120" w:type="dxa"/>
+              <w:bottom w:w="90" w:type="dxa"/>
+              <w:end w:w="120" w:type="dxa"/>
+            </w:tcMar>
+            <w:vAlign w:val="center"/>
+            <w:shd w:fill="EAF2F8"/>
+          </w:tcPr>
+          <w:p>
+            <w:pPr>
+              <w:spacing w:after="0"/>
+            </w:pPr>
+            <w:r>
+              <w:rPr>
+                <w:rFonts w:ascii="Arial" w:hAnsi="Arial"/>
+                <w:b/>
+                <w:color w:val="163A63"/>
+                <w:sz w:val="17"/>
+              </w:rPr>
+              <w:t>Ação / Descrição</w:t>
+            </w:r>
+          </w:p>
+        </w:tc>
+        <w:tc>
+          <w:tcPr>
+            <w:tcW w:type="dxa" w:w="1700"/>
+            <w:tcMar>
+              <w:top w:w="90" w:type="dxa"/>
+              <w:start w:w="120" w:type="dxa"/>
+              <w:bottom w:w="90" w:type="dxa"/>
+              <w:end w:w="120" w:type="dxa"/>
+            </w:tcMar>
+            <w:vAlign w:val="center"/>
+            <w:shd w:fill="EAF2F8"/>
+          </w:tcPr>
+          <w:p>
+            <w:pPr>
+              <w:spacing w:after="0"/>
+            </w:pPr>
+            <w:r>
+              <w:rPr>
+                <w:rFonts w:ascii="Arial" w:hAnsi="Arial"/>
+                <w:b/>
+                <w:color w:val="163A63"/>
+                <w:sz w:val="17"/>
+              </w:rPr>
+              <w:t>Responsável</w:t>
+            </w:r>
+          </w:p>
+        </w:tc>
+        <w:tc>
+          <w:tcPr>
+            <w:tcW w:type="dxa" w:w="2660"/>
+            <w:tcMar>
+              <w:top w:w="90" w:type="dxa"/>
+              <w:start w:w="120" w:type="dxa"/>
+              <w:bottom w:w="90" w:type="dxa"/>
+              <w:end w:w="120" w:type="dxa"/>
+            </w:tcMar>
+            <w:vAlign w:val="center"/>
+            <w:shd w:fill="EAF2F8"/>
+          </w:tcPr>
+          <w:p>
+            <w:pPr>
+              <w:spacing w:after="0"/>
+            </w:pPr>
+            <w:r>
+              <w:rPr>
+                <w:rFonts w:ascii="Arial" w:hAnsi="Arial"/>
+                <w:b/>
+                <w:color w:val="163A63"/>
+                <w:sz w:val="17"/>
+              </w:rPr>
+              <w:t>Observação</w:t>
+            </w:r>
+          </w:p>
+        </w:tc>
+      </w:tr>
+      <w:tr>
+        <w:tc>
+          <w:tcPr>
+            <w:tcW w:type="dxa" w:w="700"/>
+            <w:tcMar>
+              <w:top w:w="90" w:type="dxa"/>
+              <w:start w:w="120" w:type="dxa"/>
+              <w:bottom w:w="90" w:type="dxa"/>
+              <w:end w:w="120" w:type="dxa"/>
+            </w:tcMar>
+            <w:vAlign w:val="center"/>
+          </w:tcPr>
+          <w:p>
+            <w:pPr>
+              <w:spacing w:after="0"/>
+            </w:pPr>
+            <w:r>
+              <w:rPr>
+                <w:rFonts w:ascii="Arial" w:hAnsi="Arial"/>
+                <w:sz w:val="17"/>
+              </w:rPr>
+              <w:t>1</w:t>
+            </w:r>
+          </w:p>
+        </w:tc>
+        <w:tc>
+          <w:tcPr>
+            <w:tcW w:type="dxa" w:w="4300"/>
+            <w:tcMar>
+              <w:top w:w="90" w:type="dxa"/>
+              <w:start w:w="120" w:type="dxa"/>
+              <w:bottom w:w="90" w:type="dxa"/>
+              <w:end w:w="120" w:type="dxa"/>
+            </w:tcMar>
+            <w:vAlign w:val="center"/>
+          </w:tcPr>
+          <w:p>
+            <w:pPr>
+              <w:spacing w:after="0"/>
+            </w:pPr>
+            <w:r>
+              <w:rPr>
+                <w:rFonts w:ascii="Arial" w:hAnsi="Arial"/>
+                <w:sz w:val="17"/>
+              </w:rPr>
+              <w:t>Localizar o chamado técnico anterior e confirmar que o diagnóstico de condenação foi registrado e que o ativo está com status "Condenado" no GLPI.</w:t>
+            </w:r>
+          </w:p>
+        </w:tc>
+        <w:tc>
+          <w:tcPr>
+            <w:tcW w:type="dxa" w:w="1700"/>
+            <w:tcMar>
+              <w:top w:w="90" w:type="dxa"/>
+              <w:start w:w="120" w:type="dxa"/>
+              <w:bottom w:w="90" w:type="dxa"/>
+              <w:end w:w="120" w:type="dxa"/>
+            </w:tcMar>
+            <w:vAlign w:val="center"/>
+          </w:tcPr>
+          <w:p>
+            <w:pPr>
+              <w:spacing w:after="0"/>
+            </w:pPr>
+            <w:r>
+              <w:rPr>
+                <w:rFonts w:ascii="Arial" w:hAnsi="Arial"/>
+                <w:sz w:val="17"/>
+              </w:rPr>
+              <w:t>Técnico N2 Suporte</w:t>
+            </w:r>
+          </w:p>
+        </w:tc>
+        <w:tc>
+          <w:tcPr>
+            <w:tcW w:type="dxa" w:w="2660"/>
+            <w:tcMar>
+              <w:top w:w="90" w:type="dxa"/>
+              <w:start w:w="120" w:type="dxa"/>
+              <w:bottom w:w="90" w:type="dxa"/>
+              <w:end w:w="120" w:type="dxa"/>
+            </w:tcMar>
+            <w:vAlign w:val="center"/>
+          </w:tcPr>
+          <w:p>
+            <w:pPr>
+              <w:spacing w:after="0"/>
+            </w:pPr>
+            <w:r>
+              <w:rPr>
+                <w:rFonts w:ascii="Arial" w:hAnsi="Arial"/>
+                <w:sz w:val="17"/>
+              </w:rPr>
+              <w:t>A condenação do ativo deve ocorrer antes da abertura da substituição.</w:t>
+            </w:r>
+          </w:p>
+        </w:tc>
+      </w:tr>
+      <w:tr>
+        <w:tc>
+          <w:tcPr>
+            <w:tcW w:type="dxa" w:w="700"/>
+            <w:tcMar>
+              <w:top w:w="90" w:type="dxa"/>
+              <w:start w:w="120" w:type="dxa"/>
+              <w:bottom w:w="90" w:type="dxa"/>
+              <w:end w:w="120" w:type="dxa"/>
+            </w:tcMar>
+            <w:vAlign w:val="center"/>
+          </w:tcPr>
+          <w:p>
+            <w:pPr>
+              <w:spacing w:after="0"/>
+            </w:pPr>
+            <w:r>
+              <w:rPr>
+                <w:rFonts w:ascii="Arial" w:hAnsi="Arial"/>
+                <w:sz w:val="17"/>
+              </w:rPr>
+              <w:t>2</w:t>
+            </w:r>
+          </w:p>
+        </w:tc>
+        <w:tc>
+          <w:tcPr>
+            <w:tcW w:type="dxa" w:w="4300"/>
+            <w:tcMar>
+              <w:top w:w="90" w:type="dxa"/>
+              <w:start w:w="120" w:type="dxa"/>
+              <w:bottom w:w="90" w:type="dxa"/>
+              <w:end w:w="120" w:type="dxa"/>
+            </w:tcMar>
+            <w:vAlign w:val="center"/>
+          </w:tcPr>
+          <w:p>
+            <w:pPr>
+              <w:spacing w:after="0"/>
+            </w:pPr>
+            <w:r>
+              <w:rPr>
+                <w:rFonts w:ascii="Arial" w:hAnsi="Arial"/>
+                <w:sz w:val="17"/>
+              </w:rPr>
+              <w:t>Consultar o setor Administrativo para verificar se existe computador ou notebook disponível para substituir o ativo condenado.</w:t>
+            </w:r>
+          </w:p>
+        </w:tc>
+        <w:tc>
+          <w:tcPr>
+            <w:tcW w:type="dxa" w:w="1700"/>
+            <w:tcMar>
+              <w:top w:w="90" w:type="dxa"/>
+              <w:start w:w="120" w:type="dxa"/>
+              <w:bottom w:w="90" w:type="dxa"/>
+              <w:end w:w="120" w:type="dxa"/>
+            </w:tcMar>
+            <w:vAlign w:val="center"/>
+          </w:tcPr>
+          <w:p>
+            <w:pPr>
+              <w:spacing w:after="0"/>
+            </w:pPr>
+            <w:r>
+              <w:rPr>
+                <w:rFonts w:ascii="Arial" w:hAnsi="Arial"/>
+                <w:sz w:val="17"/>
+              </w:rPr>
+              <w:t>Técnico N2 Suporte / Administrativo</w:t>
+            </w:r>
+          </w:p>
+        </w:tc>
+        <w:tc>
+          <w:tcPr>
+            <w:tcW w:type="dxa" w:w="2660"/>
+            <w:tcMar>
+              <w:top w:w="90" w:type="dxa"/>
+              <w:start w:w="120" w:type="dxa"/>
+              <w:bottom w:w="90" w:type="dxa"/>
+              <w:end w:w="120" w:type="dxa"/>
+            </w:tcMar>
+            <w:vAlign w:val="center"/>
+          </w:tcPr>
+          <w:p>
+            <w:pPr>
+              <w:spacing w:after="0"/>
+            </w:pPr>
+            <w:r>
+              <w:rPr>
+                <w:rFonts w:ascii="Arial" w:hAnsi="Arial"/>
+                <w:sz w:val="17"/>
+              </w:rPr>
+              <w:t>Registrar no chamado o resultado da consulta, inclusive quando não houver equipamento disponível.</w:t>
+            </w:r>
+          </w:p>
+        </w:tc>
+      </w:tr>
+      <w:tr>
+        <w:tc>
+          <w:tcPr>
+            <w:tcW w:type="dxa" w:w="700"/>
+            <w:tcMar>
+              <w:top w:w="90" w:type="dxa"/>
+              <w:start w:w="120" w:type="dxa"/>
+              <w:bottom w:w="90" w:type="dxa"/>
+              <w:end w:w="120" w:type="dxa"/>
+            </w:tcMar>
+            <w:vAlign w:val="center"/>
+          </w:tcPr>
+          <w:p>
+            <w:pPr>
+              <w:spacing w:after="0"/>
+            </w:pPr>
+            <w:r>
+              <w:rPr>
+                <w:rFonts w:ascii="Arial" w:hAnsi="Arial"/>
+                <w:sz w:val="17"/>
+              </w:rPr>
+              <w:t>3</w:t>
+            </w:r>
+          </w:p>
+        </w:tc>
+        <w:tc>
+          <w:tcPr>
+            <w:tcW w:type="dxa" w:w="4300"/>
+            <w:tcMar>
+              <w:top w:w="90" w:type="dxa"/>
+              <w:start w:w="120" w:type="dxa"/>
+              <w:bottom w:w="90" w:type="dxa"/>
+              <w:end w:w="120" w:type="dxa"/>
+            </w:tcMar>
+            <w:vAlign w:val="center"/>
+          </w:tcPr>
+          <w:p>
+            <w:pPr>
+              <w:spacing w:after="0"/>
+            </w:pPr>
+            <w:r>
+              <w:rPr>
+                <w:rFonts w:ascii="Arial" w:hAnsi="Arial"/>
+                <w:sz w:val="17"/>
+              </w:rPr>
+              <w:t>Abrir um novo chamado no GLPI com a categorização de Substituição , conforme o catálogo de serviços, independentemente de haver equipamento disponível .</w:t>
+            </w:r>
+          </w:p>
+        </w:tc>
+        <w:tc>
+          <w:tcPr>
+            <w:tcW w:type="dxa" w:w="1700"/>
+            <w:tcMar>
+              <w:top w:w="90" w:type="dxa"/>
+              <w:start w:w="120" w:type="dxa"/>
+              <w:bottom w:w="90" w:type="dxa"/>
+              <w:end w:w="120" w:type="dxa"/>
+            </w:tcMar>
+            <w:vAlign w:val="center"/>
+          </w:tcPr>
+          <w:p>
+            <w:pPr>
+              <w:spacing w:after="0"/>
+            </w:pPr>
+            <w:r>
+              <w:rPr>
+                <w:rFonts w:ascii="Arial" w:hAnsi="Arial"/>
+                <w:sz w:val="17"/>
+              </w:rPr>
+              <w:t>Técnico N2 Suporte</w:t>
+            </w:r>
+          </w:p>
+        </w:tc>
+        <w:tc>
+          <w:tcPr>
+            <w:tcW w:type="dxa" w:w="2660"/>
+            <w:tcMar>
+              <w:top w:w="90" w:type="dxa"/>
+              <w:start w:w="120" w:type="dxa"/>
+              <w:bottom w:w="90" w:type="dxa"/>
+              <w:end w:w="120" w:type="dxa"/>
+            </w:tcMar>
+            <w:vAlign w:val="center"/>
+          </w:tcPr>
+          <w:p>
+            <w:pPr>
+              <w:spacing w:after="0"/>
+            </w:pPr>
+            <w:r>
+              <w:rPr>
+                <w:rFonts w:ascii="Arial" w:hAnsi="Arial"/>
+                <w:sz w:val="17"/>
+              </w:rPr>
+              <w:t>A indisponibilidade de máquina não impede a abertura do chamado.</w:t>
+            </w:r>
+          </w:p>
+        </w:tc>
+      </w:tr>
+      <w:tr>
+        <w:tc>
+          <w:tcPr>
+            <w:tcW w:type="dxa" w:w="700"/>
+            <w:tcMar>
+              <w:top w:w="90" w:type="dxa"/>
+              <w:start w:w="120" w:type="dxa"/>
+              <w:bottom w:w="90" w:type="dxa"/>
+              <w:end w:w="120" w:type="dxa"/>
+            </w:tcMar>
+            <w:vAlign w:val="center"/>
+          </w:tcPr>
+          <w:p>
+            <w:pPr>
+              <w:spacing w:after="0"/>
+            </w:pPr>
+            <w:r>
+              <w:rPr>
+                <w:rFonts w:ascii="Arial" w:hAnsi="Arial"/>
+                <w:sz w:val="17"/>
+              </w:rPr>
+              <w:t>4</w:t>
+            </w:r>
+          </w:p>
+        </w:tc>
+        <w:tc>
+          <w:tcPr>
+            <w:tcW w:type="dxa" w:w="4300"/>
+            <w:tcMar>
+              <w:top w:w="90" w:type="dxa"/>
+              <w:start w:w="120" w:type="dxa"/>
+              <w:bottom w:w="90" w:type="dxa"/>
+              <w:end w:w="120" w:type="dxa"/>
+            </w:tcMar>
+            <w:vAlign w:val="center"/>
+          </w:tcPr>
+          <w:p>
+            <w:pPr>
+              <w:spacing w:after="0"/>
+            </w:pPr>
+            <w:r>
+              <w:rPr>
+                <w:rFonts w:ascii="Arial" w:hAnsi="Arial"/>
+                <w:sz w:val="17"/>
+              </w:rPr>
+              <w:t>Na descrição, informar o ativo condenado, responsável pelo ativo, e-mail do usuário, unidade, setor, número patrimonial, motivo da substituição e o resultado da consulta realizada ao Administrativo.</w:t>
+            </w:r>
+          </w:p>
+        </w:tc>
+        <w:tc>
+          <w:tcPr>
+            <w:tcW w:type="dxa" w:w="1700"/>
+            <w:tcMar>
+              <w:top w:w="90" w:type="dxa"/>
+              <w:start w:w="120" w:type="dxa"/>
+              <w:bottom w:w="90" w:type="dxa"/>
+              <w:end w:w="120" w:type="dxa"/>
+            </w:tcMar>
+            <w:vAlign w:val="center"/>
+          </w:tcPr>
+          <w:p>
+            <w:pPr>
+              <w:spacing w:after="0"/>
+            </w:pPr>
+            <w:r>
+              <w:rPr>
+                <w:rFonts w:ascii="Arial" w:hAnsi="Arial"/>
+                <w:sz w:val="17"/>
+              </w:rPr>
+              <w:t>Técnico N2 Suporte</w:t>
+            </w:r>
+          </w:p>
+        </w:tc>
+        <w:tc>
+          <w:tcPr>
+            <w:tcW w:type="dxa" w:w="2660"/>
+            <w:tcMar>
+              <w:top w:w="90" w:type="dxa"/>
+              <w:start w:w="120" w:type="dxa"/>
+              <w:bottom w:w="90" w:type="dxa"/>
+              <w:end w:w="120" w:type="dxa"/>
+            </w:tcMar>
+            <w:vAlign w:val="center"/>
+          </w:tcPr>
+          <w:p>
+            <w:pPr>
+              <w:spacing w:after="0"/>
+            </w:pPr>
+            <w:r>
+              <w:rPr>
+                <w:rFonts w:ascii="Arial" w:hAnsi="Arial"/>
+                <w:sz w:val="17"/>
+              </w:rPr>
+              <w:t>Indicar claramente se há equipamento disponível, indisponível ou aguardando confirmação.</w:t>
+            </w:r>
+          </w:p>
+        </w:tc>
+      </w:tr>
+      <w:tr>
+        <w:tc>
+          <w:tcPr>
+            <w:tcW w:type="dxa" w:w="700"/>
+            <w:tcMar>
+              <w:top w:w="90" w:type="dxa"/>
+              <w:start w:w="120" w:type="dxa"/>
+              <w:bottom w:w="90" w:type="dxa"/>
+              <w:end w:w="120" w:type="dxa"/>
+            </w:tcMar>
+            <w:vAlign w:val="center"/>
+          </w:tcPr>
+          <w:p>
+            <w:pPr>
+              <w:spacing w:after="0"/>
+            </w:pPr>
+            <w:r>
+              <w:rPr>
+                <w:rFonts w:ascii="Arial" w:hAnsi="Arial"/>
+                <w:sz w:val="17"/>
+              </w:rPr>
+              <w:t>5</w:t>
+            </w:r>
+          </w:p>
+        </w:tc>
+        <w:tc>
+          <w:tcPr>
+            <w:tcW w:type="dxa" w:w="4300"/>
+            <w:tcMar>
+              <w:top w:w="90" w:type="dxa"/>
+              <w:start w:w="120" w:type="dxa"/>
+              <w:bottom w:w="90" w:type="dxa"/>
+              <w:end w:w="120" w:type="dxa"/>
+            </w:tcMar>
+            <w:vAlign w:val="center"/>
+          </w:tcPr>
+          <w:p>
+            <w:pPr>
+              <w:spacing w:after="0"/>
+            </w:pPr>
+            <w:r>
+              <w:rPr>
+                <w:rFonts w:ascii="Arial" w:hAnsi="Arial"/>
+                <w:sz w:val="17"/>
+              </w:rPr>
+              <w:t>Associar ao novo chamado o chamado técnico anterior que contém o diagnóstico e a evidência da condenação.</w:t>
+            </w:r>
+          </w:p>
+        </w:tc>
+        <w:tc>
+          <w:tcPr>
+            <w:tcW w:type="dxa" w:w="1700"/>
+            <w:tcMar>
+              <w:top w:w="90" w:type="dxa"/>
+              <w:start w:w="120" w:type="dxa"/>
+              <w:bottom w:w="90" w:type="dxa"/>
+              <w:end w:w="120" w:type="dxa"/>
+            </w:tcMar>
+            <w:vAlign w:val="center"/>
+          </w:tcPr>
+          <w:p>
+            <w:pPr>
+              <w:spacing w:after="0"/>
+            </w:pPr>
+            <w:r>
+              <w:rPr>
+                <w:rFonts w:ascii="Arial" w:hAnsi="Arial"/>
+                <w:sz w:val="17"/>
+              </w:rPr>
+              <w:t>Técnico N2 Suporte</w:t>
+            </w:r>
+          </w:p>
+        </w:tc>
+        <w:tc>
+          <w:tcPr>
+            <w:tcW w:type="dxa" w:w="2660"/>
+            <w:tcMar>
+              <w:top w:w="90" w:type="dxa"/>
+              <w:start w:w="120" w:type="dxa"/>
+              <w:bottom w:w="90" w:type="dxa"/>
+              <w:end w:w="120" w:type="dxa"/>
+            </w:tcMar>
+            <w:vAlign w:val="center"/>
+          </w:tcPr>
+          <w:p>
+            <w:pPr>
+              <w:spacing w:after="0"/>
+            </w:pPr>
+            <w:r>
+              <w:rPr>
+                <w:rFonts w:ascii="Arial" w:hAnsi="Arial"/>
+                <w:sz w:val="17"/>
+              </w:rPr>
+              <w:t>Manter a rastreabilidade entre o atendimento técnico, a condenação e a substituição.</w:t>
+            </w:r>
+          </w:p>
+        </w:tc>
+      </w:tr>
+      <w:tr>
+        <w:tc>
+          <w:tcPr>
+            <w:tcW w:type="dxa" w:w="700"/>
+            <w:tcMar>
+              <w:top w:w="90" w:type="dxa"/>
+              <w:start w:w="120" w:type="dxa"/>
+              <w:bottom w:w="90" w:type="dxa"/>
+              <w:end w:w="120" w:type="dxa"/>
+            </w:tcMar>
+            <w:vAlign w:val="center"/>
+          </w:tcPr>
+          <w:p>
+            <w:pPr>
+              <w:spacing w:after="0"/>
+            </w:pPr>
+            <w:r>
+              <w:rPr>
+                <w:rFonts w:ascii="Arial" w:hAnsi="Arial"/>
+                <w:sz w:val="17"/>
+              </w:rPr>
+              <w:t>6</w:t>
+            </w:r>
+          </w:p>
+        </w:tc>
+        <w:tc>
+          <w:tcPr>
+            <w:tcW w:type="dxa" w:w="4300"/>
+            <w:tcMar>
+              <w:top w:w="90" w:type="dxa"/>
+              <w:start w:w="120" w:type="dxa"/>
+              <w:bottom w:w="90" w:type="dxa"/>
+              <w:end w:w="120" w:type="dxa"/>
+            </w:tcMar>
+            <w:vAlign w:val="center"/>
+          </w:tcPr>
+          <w:p>
+            <w:pPr>
+              <w:spacing w:after="0"/>
+            </w:pPr>
+            <w:r>
+              <w:rPr>
+                <w:rFonts w:ascii="Arial" w:hAnsi="Arial"/>
+                <w:sz w:val="17"/>
+              </w:rPr>
+              <w:t>Na aba "Itens" , clicar em "+ Adicionar item" e associar o ativo condenado que deverá ser substituído.</w:t>
+            </w:r>
+          </w:p>
+        </w:tc>
+        <w:tc>
+          <w:tcPr>
+            <w:tcW w:type="dxa" w:w="1700"/>
+            <w:tcMar>
+              <w:top w:w="90" w:type="dxa"/>
+              <w:start w:w="120" w:type="dxa"/>
+              <w:bottom w:w="90" w:type="dxa"/>
+              <w:end w:w="120" w:type="dxa"/>
+            </w:tcMar>
+            <w:vAlign w:val="center"/>
+          </w:tcPr>
+          <w:p>
+            <w:pPr>
+              <w:spacing w:after="0"/>
+            </w:pPr>
+            <w:r>
+              <w:rPr>
+                <w:rFonts w:ascii="Arial" w:hAnsi="Arial"/>
+                <w:sz w:val="17"/>
+              </w:rPr>
+              <w:t>Técnico N2 Suporte</w:t>
+            </w:r>
+          </w:p>
+        </w:tc>
+        <w:tc>
+          <w:tcPr>
+            <w:tcW w:type="dxa" w:w="2660"/>
+            <w:tcMar>
+              <w:top w:w="90" w:type="dxa"/>
+              <w:start w:w="120" w:type="dxa"/>
+              <w:bottom w:w="90" w:type="dxa"/>
+              <w:end w:w="120" w:type="dxa"/>
+            </w:tcMar>
+            <w:vAlign w:val="center"/>
+          </w:tcPr>
+          <w:p>
+            <w:pPr>
+              <w:spacing w:after="0"/>
+            </w:pPr>
+            <w:r>
+              <w:rPr>
+                <w:rFonts w:ascii="Arial" w:hAnsi="Arial"/>
+                <w:sz w:val="17"/>
+              </w:rPr>
+              <w:t>O ativo condenado deve permanecer cadastrado no GLPI.</w:t>
+            </w:r>
+          </w:p>
+        </w:tc>
+      </w:tr>
+      <w:tr>
+        <w:tc>
+          <w:tcPr>
+            <w:tcW w:type="dxa" w:w="700"/>
+            <w:tcMar>
+              <w:top w:w="90" w:type="dxa"/>
+              <w:start w:w="120" w:type="dxa"/>
+              <w:bottom w:w="90" w:type="dxa"/>
+              <w:end w:w="120" w:type="dxa"/>
+            </w:tcMar>
+            <w:vAlign w:val="center"/>
+          </w:tcPr>
+          <w:p>
+            <w:pPr>
+              <w:spacing w:after="0"/>
+            </w:pPr>
+            <w:r>
+              <w:rPr>
+                <w:rFonts w:ascii="Arial" w:hAnsi="Arial"/>
+                <w:sz w:val="17"/>
+              </w:rPr>
+              <w:t>7</w:t>
+            </w:r>
+          </w:p>
+        </w:tc>
+        <w:tc>
+          <w:tcPr>
+            <w:tcW w:type="dxa" w:w="4300"/>
+            <w:tcMar>
+              <w:top w:w="90" w:type="dxa"/>
+              <w:start w:w="120" w:type="dxa"/>
+              <w:bottom w:w="90" w:type="dxa"/>
+              <w:end w:w="120" w:type="dxa"/>
+            </w:tcMar>
+            <w:vAlign w:val="center"/>
+          </w:tcPr>
+          <w:p>
+            <w:pPr>
+              <w:spacing w:after="0"/>
+            </w:pPr>
+            <w:r>
+              <w:rPr>
+                <w:rFonts w:ascii="Arial" w:hAnsi="Arial"/>
+                <w:sz w:val="17"/>
+              </w:rPr>
+              <w:t>Se houver equipamento disponível, registrar em acompanhamento a identificação do ativo substituto. Se não houver, registrar explicitamente que a substituição aguarda disponibilidade do Administrativo.</w:t>
+            </w:r>
+          </w:p>
+        </w:tc>
+        <w:tc>
+          <w:tcPr>
+            <w:tcW w:type="dxa" w:w="1700"/>
+            <w:tcMar>
+              <w:top w:w="90" w:type="dxa"/>
+              <w:start w:w="120" w:type="dxa"/>
+              <w:bottom w:w="90" w:type="dxa"/>
+              <w:end w:w="120" w:type="dxa"/>
+            </w:tcMar>
+            <w:vAlign w:val="center"/>
+          </w:tcPr>
+          <w:p>
+            <w:pPr>
+              <w:spacing w:after="0"/>
+            </w:pPr>
+            <w:r>
+              <w:rPr>
+                <w:rFonts w:ascii="Arial" w:hAnsi="Arial"/>
+                <w:sz w:val="17"/>
+              </w:rPr>
+              <w:t>Técnico N2 Suporte / Administrativo</w:t>
+            </w:r>
+          </w:p>
+        </w:tc>
+        <w:tc>
+          <w:tcPr>
+            <w:tcW w:type="dxa" w:w="2660"/>
+            <w:tcMar>
+              <w:top w:w="90" w:type="dxa"/>
+              <w:start w:w="120" w:type="dxa"/>
+              <w:bottom w:w="90" w:type="dxa"/>
+              <w:end w:w="120" w:type="dxa"/>
+            </w:tcMar>
+            <w:vAlign w:val="center"/>
+          </w:tcPr>
+          <w:p>
+            <w:pPr>
+              <w:spacing w:after="0"/>
+            </w:pPr>
+            <w:r>
+              <w:rPr>
+                <w:rFonts w:ascii="Arial" w:hAnsi="Arial"/>
+                <w:sz w:val="17"/>
+              </w:rPr>
+              <w:t>Quando disponível, informar patrimônio, série ou identificação do substituto.</w:t>
+            </w:r>
+          </w:p>
+        </w:tc>
+      </w:tr>
+      <w:tr>
+        <w:tc>
+          <w:tcPr>
+            <w:tcW w:type="dxa" w:w="700"/>
+            <w:tcMar>
+              <w:top w:w="90" w:type="dxa"/>
+              <w:start w:w="120" w:type="dxa"/>
+              <w:bottom w:w="90" w:type="dxa"/>
+              <w:end w:w="120" w:type="dxa"/>
+            </w:tcMar>
+            <w:vAlign w:val="center"/>
+          </w:tcPr>
+          <w:p>
+            <w:pPr>
+              <w:spacing w:after="0"/>
+            </w:pPr>
+            <w:r>
+              <w:rPr>
+                <w:rFonts w:ascii="Arial" w:hAnsi="Arial"/>
+                <w:sz w:val="17"/>
+              </w:rPr>
+              <w:t>8</w:t>
+            </w:r>
+          </w:p>
+        </w:tc>
+        <w:tc>
+          <w:tcPr>
+            <w:tcW w:type="dxa" w:w="4300"/>
+            <w:tcMar>
+              <w:top w:w="90" w:type="dxa"/>
+              <w:start w:w="120" w:type="dxa"/>
+              <w:bottom w:w="90" w:type="dxa"/>
+              <w:end w:w="120" w:type="dxa"/>
+            </w:tcMar>
+            <w:vAlign w:val="center"/>
+          </w:tcPr>
+          <w:p>
+            <w:pPr>
+              <w:spacing w:after="0"/>
+            </w:pPr>
+            <w:r>
+              <w:rPr>
+                <w:rFonts w:ascii="Arial" w:hAnsi="Arial"/>
+                <w:sz w:val="17"/>
+              </w:rPr>
+              <w:t>Salvar o chamado e alterar seu status para "Pendente" , mantendo-o nesse status até a disponibilização do equipamento e a conclusão da substituição.</w:t>
+            </w:r>
+          </w:p>
+        </w:tc>
+        <w:tc>
+          <w:tcPr>
+            <w:tcW w:type="dxa" w:w="1700"/>
+            <w:tcMar>
+              <w:top w:w="90" w:type="dxa"/>
+              <w:start w:w="120" w:type="dxa"/>
+              <w:bottom w:w="90" w:type="dxa"/>
+              <w:end w:w="120" w:type="dxa"/>
+            </w:tcMar>
+            <w:vAlign w:val="center"/>
+          </w:tcPr>
+          <w:p>
+            <w:pPr>
+              <w:spacing w:after="0"/>
+            </w:pPr>
+            <w:r>
+              <w:rPr>
+                <w:rFonts w:ascii="Arial" w:hAnsi="Arial"/>
+                <w:sz w:val="17"/>
+              </w:rPr>
+              <w:t>Técnico N2 Suporte</w:t>
+            </w:r>
+          </w:p>
+        </w:tc>
+        <w:tc>
+          <w:tcPr>
+            <w:tcW w:type="dxa" w:w="2660"/>
+            <w:tcMar>
+              <w:top w:w="90" w:type="dxa"/>
+              <w:start w:w="120" w:type="dxa"/>
+              <w:bottom w:w="90" w:type="dxa"/>
+              <w:end w:w="120" w:type="dxa"/>
+            </w:tcMar>
+            <w:vAlign w:val="center"/>
+          </w:tcPr>
+          <w:p>
+            <w:pPr>
+              <w:spacing w:after="0"/>
+            </w:pPr>
+            <w:r>
+              <w:rPr>
+                <w:rFonts w:ascii="Arial" w:hAnsi="Arial"/>
+                <w:sz w:val="17"/>
+              </w:rPr>
+              <w:t>O status Pendente é obrigatório, exista ou não máquina disponível no momento da abertura.</w:t>
+            </w:r>
+          </w:p>
+        </w:tc>
+      </w:tr>
+    </w:tbl>
+    <w:p>
+      <w:pPr>
+        <w:spacing w:after="40"/>
+      </w:pPr>
+    </w:p>
+    <w:p>
+      <w:pPr>
+        <w:spacing w:after="80"/>
+      </w:pPr>
+      <w:r>
+        <w:rPr>
+          <w:color w:val="163A63"/>
+        </w:rPr>
+        <w:t>⚠️ Registro obrigatório: O chamado de substituição deve ser aberto em todos os casos, conter o ativo condenado, o resultado da consulta ao Administrativo, a associação com o chamado técnico anterior e permanecer com status Pendente até a conclusão.</w:t>
       </w:r>
     </w:p>
     <w:p>

</xml_diff>

<commit_message>
Atualiza Word padronizado processo_substituicao_condenacao_ativos_glpi
</commit_message>
<xml_diff>
--- a/documentações/Processos/docx/processo_substituicao_condenacao_ativos_glpi.docx
+++ b/documentações/Processos/docx/processo_substituicao_condenacao_ativos_glpi.docx
@@ -399,492 +399,7 @@
         <w:pStyle w:val="Heading1"/>
       </w:pPr>
       <w:r>
-        <w:t>Definições</w:t>
-      </w:r>
-    </w:p>
-    <w:tbl>
-      <w:tblPr>
-        <w:tblStyle w:val="TableGrid"/>
-        <w:tblW w:type="auto" w:w="0"/>
-        <w:jc w:val="center"/>
-        <w:tblLayout w:type="fixed"/>
-        <w:tblLook w:firstColumn="1" w:firstRow="1" w:lastColumn="0" w:lastRow="0" w:noHBand="0" w:noVBand="1" w:val="04A0"/>
-      </w:tblPr>
-      <w:tblGrid>
-        <w:gridCol w:w="2600"/>
-        <w:gridCol w:w="6760"/>
-      </w:tblGrid>
-      <w:tr>
-        <w:trPr>
-          <w:tblHeader w:val="true"/>
-        </w:trPr>
-        <w:tc>
-          <w:tcPr>
-            <w:tcW w:type="dxa" w:w="2600"/>
-            <w:tcMar>
-              <w:top w:w="90" w:type="dxa"/>
-              <w:start w:w="120" w:type="dxa"/>
-              <w:bottom w:w="90" w:type="dxa"/>
-              <w:end w:w="120" w:type="dxa"/>
-            </w:tcMar>
-            <w:vAlign w:val="center"/>
-            <w:shd w:fill="EAF2F8"/>
-          </w:tcPr>
-          <w:p>
-            <w:pPr>
-              <w:spacing w:after="0"/>
-            </w:pPr>
-            <w:r>
-              <w:rPr>
-                <w:rFonts w:ascii="Arial" w:hAnsi="Arial"/>
-                <w:b/>
-                <w:color w:val="163A63"/>
-                <w:sz w:val="18"/>
-              </w:rPr>
-              <w:t>Termo</w:t>
-            </w:r>
-          </w:p>
-        </w:tc>
-        <w:tc>
-          <w:tcPr>
-            <w:tcW w:type="dxa" w:w="6760"/>
-            <w:tcMar>
-              <w:top w:w="90" w:type="dxa"/>
-              <w:start w:w="120" w:type="dxa"/>
-              <w:bottom w:w="90" w:type="dxa"/>
-              <w:end w:w="120" w:type="dxa"/>
-            </w:tcMar>
-            <w:vAlign w:val="center"/>
-            <w:shd w:fill="EAF2F8"/>
-          </w:tcPr>
-          <w:p>
-            <w:pPr>
-              <w:spacing w:after="0"/>
-            </w:pPr>
-            <w:r>
-              <w:rPr>
-                <w:rFonts w:ascii="Arial" w:hAnsi="Arial"/>
-                <w:b/>
-                <w:color w:val="163A63"/>
-                <w:sz w:val="18"/>
-              </w:rPr>
-              <w:t>Definição</w:t>
-            </w:r>
-          </w:p>
-        </w:tc>
-      </w:tr>
-      <w:tr>
-        <w:tc>
-          <w:tcPr>
-            <w:tcW w:type="dxa" w:w="2600"/>
-            <w:tcMar>
-              <w:top w:w="90" w:type="dxa"/>
-              <w:start w:w="120" w:type="dxa"/>
-              <w:bottom w:w="90" w:type="dxa"/>
-              <w:end w:w="120" w:type="dxa"/>
-            </w:tcMar>
-            <w:vAlign w:val="center"/>
-          </w:tcPr>
-          <w:p>
-            <w:pPr>
-              <w:spacing w:after="0"/>
-            </w:pPr>
-            <w:r>
-              <w:rPr>
-                <w:rFonts w:ascii="Arial" w:hAnsi="Arial"/>
-                <w:sz w:val="18"/>
-              </w:rPr>
-              <w:t>GLPI</w:t>
-            </w:r>
-          </w:p>
-        </w:tc>
-        <w:tc>
-          <w:tcPr>
-            <w:tcW w:type="dxa" w:w="6760"/>
-            <w:tcMar>
-              <w:top w:w="90" w:type="dxa"/>
-              <w:start w:w="120" w:type="dxa"/>
-              <w:bottom w:w="90" w:type="dxa"/>
-              <w:end w:w="120" w:type="dxa"/>
-            </w:tcMar>
-            <w:vAlign w:val="center"/>
-          </w:tcPr>
-          <w:p>
-            <w:pPr>
-              <w:spacing w:after="0"/>
-            </w:pPr>
-            <w:r>
-              <w:rPr>
-                <w:rFonts w:ascii="Arial" w:hAnsi="Arial"/>
-                <w:sz w:val="18"/>
-              </w:rPr>
-              <w:t>Sistema de gestão de chamados e inventário de TI utilizado pela GTIC.</w:t>
-            </w:r>
-          </w:p>
-        </w:tc>
-      </w:tr>
-      <w:tr>
-        <w:tc>
-          <w:tcPr>
-            <w:tcW w:type="dxa" w:w="2600"/>
-            <w:tcMar>
-              <w:top w:w="90" w:type="dxa"/>
-              <w:start w:w="120" w:type="dxa"/>
-              <w:bottom w:w="90" w:type="dxa"/>
-              <w:end w:w="120" w:type="dxa"/>
-            </w:tcMar>
-            <w:vAlign w:val="center"/>
-          </w:tcPr>
-          <w:p>
-            <w:pPr>
-              <w:spacing w:after="0"/>
-            </w:pPr>
-            <w:r>
-              <w:rPr>
-                <w:rFonts w:ascii="Arial" w:hAnsi="Arial"/>
-                <w:sz w:val="18"/>
-              </w:rPr>
-              <w:t>Ativo</w:t>
-            </w:r>
-          </w:p>
-        </w:tc>
-        <w:tc>
-          <w:tcPr>
-            <w:tcW w:type="dxa" w:w="6760"/>
-            <w:tcMar>
-              <w:top w:w="90" w:type="dxa"/>
-              <w:start w:w="120" w:type="dxa"/>
-              <w:bottom w:w="90" w:type="dxa"/>
-              <w:end w:w="120" w:type="dxa"/>
-            </w:tcMar>
-            <w:vAlign w:val="center"/>
-          </w:tcPr>
-          <w:p>
-            <w:pPr>
-              <w:spacing w:after="0"/>
-            </w:pPr>
-            <w:r>
-              <w:rPr>
-                <w:rFonts w:ascii="Arial" w:hAnsi="Arial"/>
-                <w:sz w:val="18"/>
-              </w:rPr>
-              <w:t>Equipamento ou item de TI cadastrado no inventário do GLPI (computador, impressora, monitor, roteador, etc.).</w:t>
-            </w:r>
-          </w:p>
-        </w:tc>
-      </w:tr>
-      <w:tr>
-        <w:tc>
-          <w:tcPr>
-            <w:tcW w:type="dxa" w:w="2600"/>
-            <w:tcMar>
-              <w:top w:w="90" w:type="dxa"/>
-              <w:start w:w="120" w:type="dxa"/>
-              <w:bottom w:w="90" w:type="dxa"/>
-              <w:end w:w="120" w:type="dxa"/>
-            </w:tcMar>
-            <w:vAlign w:val="center"/>
-          </w:tcPr>
-          <w:p>
-            <w:pPr>
-              <w:spacing w:after="0"/>
-            </w:pPr>
-            <w:r>
-              <w:rPr>
-                <w:rFonts w:ascii="Arial" w:hAnsi="Arial"/>
-                <w:sz w:val="18"/>
-              </w:rPr>
-              <w:t>Chamado</w:t>
-            </w:r>
-          </w:p>
-        </w:tc>
-        <w:tc>
-          <w:tcPr>
-            <w:tcW w:type="dxa" w:w="6760"/>
-            <w:tcMar>
-              <w:top w:w="90" w:type="dxa"/>
-              <w:start w:w="120" w:type="dxa"/>
-              <w:bottom w:w="90" w:type="dxa"/>
-              <w:end w:w="120" w:type="dxa"/>
-            </w:tcMar>
-            <w:vAlign w:val="center"/>
-          </w:tcPr>
-          <w:p>
-            <w:pPr>
-              <w:spacing w:after="0"/>
-            </w:pPr>
-            <w:r>
-              <w:rPr>
-                <w:rFonts w:ascii="Arial" w:hAnsi="Arial"/>
-                <w:sz w:val="18"/>
-              </w:rPr>
-              <w:t>Registro de solicitação, incidente ou requisição aberto no GLPI.</w:t>
-            </w:r>
-          </w:p>
-        </w:tc>
-      </w:tr>
-      <w:tr>
-        <w:tc>
-          <w:tcPr>
-            <w:tcW w:type="dxa" w:w="2600"/>
-            <w:tcMar>
-              <w:top w:w="90" w:type="dxa"/>
-              <w:start w:w="120" w:type="dxa"/>
-              <w:bottom w:w="90" w:type="dxa"/>
-              <w:end w:w="120" w:type="dxa"/>
-            </w:tcMar>
-            <w:vAlign w:val="center"/>
-          </w:tcPr>
-          <w:p>
-            <w:pPr>
-              <w:spacing w:after="0"/>
-            </w:pPr>
-            <w:r>
-              <w:rPr>
-                <w:rFonts w:ascii="Arial" w:hAnsi="Arial"/>
-                <w:sz w:val="18"/>
-              </w:rPr>
-              <w:t>Patrimônio</w:t>
-            </w:r>
-          </w:p>
-        </w:tc>
-        <w:tc>
-          <w:tcPr>
-            <w:tcW w:type="dxa" w:w="6760"/>
-            <w:tcMar>
-              <w:top w:w="90" w:type="dxa"/>
-              <w:start w:w="120" w:type="dxa"/>
-              <w:bottom w:w="90" w:type="dxa"/>
-              <w:end w:w="120" w:type="dxa"/>
-            </w:tcMar>
-            <w:vAlign w:val="center"/>
-          </w:tcPr>
-          <w:p>
-            <w:pPr>
-              <w:spacing w:after="0"/>
-            </w:pPr>
-            <w:r>
-              <w:rPr>
-                <w:rFonts w:ascii="Arial" w:hAnsi="Arial"/>
-                <w:sz w:val="18"/>
-              </w:rPr>
-              <w:t>Setor responsável pelo controle patrimonial dos bens da Secretaria de Saúde do Recife.</w:t>
-            </w:r>
-          </w:p>
-        </w:tc>
-      </w:tr>
-      <w:tr>
-        <w:tc>
-          <w:tcPr>
-            <w:tcW w:type="dxa" w:w="2600"/>
-            <w:tcMar>
-              <w:top w:w="90" w:type="dxa"/>
-              <w:start w:w="120" w:type="dxa"/>
-              <w:bottom w:w="90" w:type="dxa"/>
-              <w:end w:w="120" w:type="dxa"/>
-            </w:tcMar>
-            <w:vAlign w:val="center"/>
-          </w:tcPr>
-          <w:p>
-            <w:pPr>
-              <w:spacing w:after="0"/>
-            </w:pPr>
-            <w:r>
-              <w:rPr>
-                <w:rFonts w:ascii="Arial" w:hAnsi="Arial"/>
-                <w:sz w:val="18"/>
-              </w:rPr>
-              <w:t>Ciclo de vida do ativo</w:t>
-            </w:r>
-          </w:p>
-        </w:tc>
-        <w:tc>
-          <w:tcPr>
-            <w:tcW w:type="dxa" w:w="6760"/>
-            <w:tcMar>
-              <w:top w:w="90" w:type="dxa"/>
-              <w:start w:w="120" w:type="dxa"/>
-              <w:bottom w:w="90" w:type="dxa"/>
-              <w:end w:w="120" w:type="dxa"/>
-            </w:tcMar>
-            <w:vAlign w:val="center"/>
-          </w:tcPr>
-          <w:p>
-            <w:pPr>
-              <w:spacing w:after="0"/>
-            </w:pPr>
-            <w:r>
-              <w:rPr>
-                <w:rFonts w:ascii="Arial" w:hAnsi="Arial"/>
-                <w:sz w:val="18"/>
-              </w:rPr>
-              <w:t>Conjunto de status que um ativo percorre ao longo de sua existência: Em uso → Em manutenção → Condenado / Baixado.</w:t>
-            </w:r>
-          </w:p>
-        </w:tc>
-      </w:tr>
-      <w:tr>
-        <w:tc>
-          <w:tcPr>
-            <w:tcW w:type="dxa" w:w="2600"/>
-            <w:tcMar>
-              <w:top w:w="90" w:type="dxa"/>
-              <w:start w:w="120" w:type="dxa"/>
-              <w:bottom w:w="90" w:type="dxa"/>
-              <w:end w:w="120" w:type="dxa"/>
-            </w:tcMar>
-            <w:vAlign w:val="center"/>
-          </w:tcPr>
-          <w:p>
-            <w:pPr>
-              <w:spacing w:after="0"/>
-            </w:pPr>
-            <w:r>
-              <w:rPr>
-                <w:rFonts w:ascii="Arial" w:hAnsi="Arial"/>
-                <w:sz w:val="18"/>
-              </w:rPr>
-              <w:t>Condenado</w:t>
-            </w:r>
-          </w:p>
-        </w:tc>
-        <w:tc>
-          <w:tcPr>
-            <w:tcW w:type="dxa" w:w="6760"/>
-            <w:tcMar>
-              <w:top w:w="90" w:type="dxa"/>
-              <w:start w:w="120" w:type="dxa"/>
-              <w:bottom w:w="90" w:type="dxa"/>
-              <w:end w:w="120" w:type="dxa"/>
-            </w:tcMar>
-            <w:vAlign w:val="center"/>
-          </w:tcPr>
-          <w:p>
-            <w:pPr>
-              <w:spacing w:after="0"/>
-            </w:pPr>
-            <w:r>
-              <w:rPr>
-                <w:rFonts w:ascii="Arial" w:hAnsi="Arial"/>
-                <w:sz w:val="18"/>
-              </w:rPr>
-              <w:t>Status do ativo quando está inoperante e aprovado formalmente para descarte ou baixa patrimonial.</w:t>
-            </w:r>
-          </w:p>
-        </w:tc>
-      </w:tr>
-      <w:tr>
-        <w:tc>
-          <w:tcPr>
-            <w:tcW w:type="dxa" w:w="2600"/>
-            <w:tcMar>
-              <w:top w:w="90" w:type="dxa"/>
-              <w:start w:w="120" w:type="dxa"/>
-              <w:bottom w:w="90" w:type="dxa"/>
-              <w:end w:w="120" w:type="dxa"/>
-            </w:tcMar>
-            <w:vAlign w:val="center"/>
-          </w:tcPr>
-          <w:p>
-            <w:pPr>
-              <w:spacing w:after="0"/>
-            </w:pPr>
-            <w:r>
-              <w:rPr>
-                <w:rFonts w:ascii="Arial" w:hAnsi="Arial"/>
-                <w:sz w:val="18"/>
-              </w:rPr>
-              <w:t>Central de Serviços</w:t>
-            </w:r>
-          </w:p>
-        </w:tc>
-        <w:tc>
-          <w:tcPr>
-            <w:tcW w:type="dxa" w:w="6760"/>
-            <w:tcMar>
-              <w:top w:w="90" w:type="dxa"/>
-              <w:start w:w="120" w:type="dxa"/>
-              <w:bottom w:w="90" w:type="dxa"/>
-              <w:end w:w="120" w:type="dxa"/>
-            </w:tcMar>
-            <w:vAlign w:val="center"/>
-          </w:tcPr>
-          <w:p>
-            <w:pPr>
-              <w:spacing w:after="0"/>
-            </w:pPr>
-            <w:r>
-              <w:rPr>
-                <w:rFonts w:ascii="Arial" w:hAnsi="Arial"/>
-                <w:sz w:val="18"/>
-              </w:rPr>
-              <w:t>Equipe responsável pela abertura de todos os chamados no GLPI (N1).</w:t>
-            </w:r>
-          </w:p>
-        </w:tc>
-      </w:tr>
-      <w:tr>
-        <w:tc>
-          <w:tcPr>
-            <w:tcW w:type="dxa" w:w="2600"/>
-            <w:tcMar>
-              <w:top w:w="90" w:type="dxa"/>
-              <w:start w:w="120" w:type="dxa"/>
-              <w:bottom w:w="90" w:type="dxa"/>
-              <w:end w:w="120" w:type="dxa"/>
-            </w:tcMar>
-            <w:vAlign w:val="center"/>
-          </w:tcPr>
-          <w:p>
-            <w:pPr>
-              <w:spacing w:after="0"/>
-            </w:pPr>
-            <w:r>
-              <w:rPr>
-                <w:rFonts w:ascii="Arial" w:hAnsi="Arial"/>
-                <w:sz w:val="18"/>
-              </w:rPr>
-              <w:t>N2</w:t>
-            </w:r>
-          </w:p>
-        </w:tc>
-        <w:tc>
-          <w:tcPr>
-            <w:tcW w:type="dxa" w:w="6760"/>
-            <w:tcMar>
-              <w:top w:w="90" w:type="dxa"/>
-              <w:start w:w="120" w:type="dxa"/>
-              <w:bottom w:w="90" w:type="dxa"/>
-              <w:end w:w="120" w:type="dxa"/>
-            </w:tcMar>
-            <w:vAlign w:val="center"/>
-          </w:tcPr>
-          <w:p>
-            <w:pPr>
-              <w:spacing w:after="0"/>
-            </w:pPr>
-            <w:r>
-              <w:rPr>
-                <w:rFonts w:ascii="Arial" w:hAnsi="Arial"/>
-                <w:sz w:val="18"/>
-              </w:rPr>
-              <w:t>Técnico de suporte de segundo nível, responsável pelo atendimento presencial ou remoto avançado.</w:t>
-            </w:r>
-          </w:p>
-        </w:tc>
-      </w:tr>
-    </w:tbl>
-    <w:p>
-      <w:pPr>
-        <w:spacing w:after="40"/>
-      </w:pPr>
-    </w:p>
-    <w:p>
-      <w:pPr>
-        <w:pStyle w:val="Heading1"/>
-      </w:pPr>
-      <w:r>
-        <w:t>Fluxo resumido Visão rápida</w:t>
+        <w:t>Fluxo resumido</w:t>
       </w:r>
     </w:p>
     <w:p>
@@ -924,7 +439,7 @@
         <w:pStyle w:val="Heading1"/>
       </w:pPr>
       <w:r>
-        <w:t>Processo 1 Abertura do Chamado</w:t>
+        <w:t>Processo 1 - Abertura do Chamado</w:t>
       </w:r>
     </w:p>
     <w:p>
@@ -1773,7 +1288,7 @@
         <w:pStyle w:val="Heading1"/>
       </w:pPr>
       <w:r>
-        <w:t>Processo 2 Execução / Atendimento Técnico</w:t>
+        <w:t>Processo 2 - Execução / Atendimento Técnico</w:t>
       </w:r>
     </w:p>
     <w:tbl>
@@ -2415,7 +1930,7 @@
         <w:pStyle w:val="Heading1"/>
       </w:pPr>
       <w:r>
-        <w:t>Processo 3 Condenação do Ativo</w:t>
+        <w:t>Processo 3 - Condenação do Ativo</w:t>
       </w:r>
     </w:p>
     <w:p>
@@ -3068,7 +2583,7 @@
         <w:pStyle w:val="Heading1"/>
       </w:pPr>
       <w:r>
-        <w:t>Processo 4 Abertura do Chamado de Substituição</w:t>
+        <w:t>Processo 4 - Abertura do Chamado de Substituição</w:t>
       </w:r>
     </w:p>
     <w:p>
@@ -4015,6 +3530,491 @@
         <w:pStyle w:val="Heading1"/>
       </w:pPr>
       <w:r>
+        <w:t>Definições</w:t>
+      </w:r>
+    </w:p>
+    <w:tbl>
+      <w:tblPr>
+        <w:tblStyle w:val="TableGrid"/>
+        <w:tblW w:type="auto" w:w="0"/>
+        <w:jc w:val="center"/>
+        <w:tblLayout w:type="fixed"/>
+        <w:tblLook w:firstColumn="1" w:firstRow="1" w:lastColumn="0" w:lastRow="0" w:noHBand="0" w:noVBand="1" w:val="04A0"/>
+      </w:tblPr>
+      <w:tblGrid>
+        <w:gridCol w:w="2600"/>
+        <w:gridCol w:w="6760"/>
+      </w:tblGrid>
+      <w:tr>
+        <w:trPr>
+          <w:tblHeader w:val="true"/>
+        </w:trPr>
+        <w:tc>
+          <w:tcPr>
+            <w:tcW w:type="dxa" w:w="2600"/>
+            <w:tcMar>
+              <w:top w:w="90" w:type="dxa"/>
+              <w:start w:w="120" w:type="dxa"/>
+              <w:bottom w:w="90" w:type="dxa"/>
+              <w:end w:w="120" w:type="dxa"/>
+            </w:tcMar>
+            <w:vAlign w:val="center"/>
+            <w:shd w:fill="EAF2F8"/>
+          </w:tcPr>
+          <w:p>
+            <w:pPr>
+              <w:spacing w:after="0"/>
+            </w:pPr>
+            <w:r>
+              <w:rPr>
+                <w:rFonts w:ascii="Arial" w:hAnsi="Arial"/>
+                <w:b/>
+                <w:color w:val="163A63"/>
+                <w:sz w:val="18"/>
+              </w:rPr>
+              <w:t>Termo</w:t>
+            </w:r>
+          </w:p>
+        </w:tc>
+        <w:tc>
+          <w:tcPr>
+            <w:tcW w:type="dxa" w:w="6760"/>
+            <w:tcMar>
+              <w:top w:w="90" w:type="dxa"/>
+              <w:start w:w="120" w:type="dxa"/>
+              <w:bottom w:w="90" w:type="dxa"/>
+              <w:end w:w="120" w:type="dxa"/>
+            </w:tcMar>
+            <w:vAlign w:val="center"/>
+            <w:shd w:fill="EAF2F8"/>
+          </w:tcPr>
+          <w:p>
+            <w:pPr>
+              <w:spacing w:after="0"/>
+            </w:pPr>
+            <w:r>
+              <w:rPr>
+                <w:rFonts w:ascii="Arial" w:hAnsi="Arial"/>
+                <w:b/>
+                <w:color w:val="163A63"/>
+                <w:sz w:val="18"/>
+              </w:rPr>
+              <w:t>Definição</w:t>
+            </w:r>
+          </w:p>
+        </w:tc>
+      </w:tr>
+      <w:tr>
+        <w:tc>
+          <w:tcPr>
+            <w:tcW w:type="dxa" w:w="2600"/>
+            <w:tcMar>
+              <w:top w:w="90" w:type="dxa"/>
+              <w:start w:w="120" w:type="dxa"/>
+              <w:bottom w:w="90" w:type="dxa"/>
+              <w:end w:w="120" w:type="dxa"/>
+            </w:tcMar>
+            <w:vAlign w:val="center"/>
+          </w:tcPr>
+          <w:p>
+            <w:pPr>
+              <w:spacing w:after="0"/>
+            </w:pPr>
+            <w:r>
+              <w:rPr>
+                <w:rFonts w:ascii="Arial" w:hAnsi="Arial"/>
+                <w:sz w:val="18"/>
+              </w:rPr>
+              <w:t>GLPI</w:t>
+            </w:r>
+          </w:p>
+        </w:tc>
+        <w:tc>
+          <w:tcPr>
+            <w:tcW w:type="dxa" w:w="6760"/>
+            <w:tcMar>
+              <w:top w:w="90" w:type="dxa"/>
+              <w:start w:w="120" w:type="dxa"/>
+              <w:bottom w:w="90" w:type="dxa"/>
+              <w:end w:w="120" w:type="dxa"/>
+            </w:tcMar>
+            <w:vAlign w:val="center"/>
+          </w:tcPr>
+          <w:p>
+            <w:pPr>
+              <w:spacing w:after="0"/>
+            </w:pPr>
+            <w:r>
+              <w:rPr>
+                <w:rFonts w:ascii="Arial" w:hAnsi="Arial"/>
+                <w:sz w:val="18"/>
+              </w:rPr>
+              <w:t>Sistema de gestão de chamados e inventário de TI utilizado pela GTIC.</w:t>
+            </w:r>
+          </w:p>
+        </w:tc>
+      </w:tr>
+      <w:tr>
+        <w:tc>
+          <w:tcPr>
+            <w:tcW w:type="dxa" w:w="2600"/>
+            <w:tcMar>
+              <w:top w:w="90" w:type="dxa"/>
+              <w:start w:w="120" w:type="dxa"/>
+              <w:bottom w:w="90" w:type="dxa"/>
+              <w:end w:w="120" w:type="dxa"/>
+            </w:tcMar>
+            <w:vAlign w:val="center"/>
+          </w:tcPr>
+          <w:p>
+            <w:pPr>
+              <w:spacing w:after="0"/>
+            </w:pPr>
+            <w:r>
+              <w:rPr>
+                <w:rFonts w:ascii="Arial" w:hAnsi="Arial"/>
+                <w:sz w:val="18"/>
+              </w:rPr>
+              <w:t>Ativo</w:t>
+            </w:r>
+          </w:p>
+        </w:tc>
+        <w:tc>
+          <w:tcPr>
+            <w:tcW w:type="dxa" w:w="6760"/>
+            <w:tcMar>
+              <w:top w:w="90" w:type="dxa"/>
+              <w:start w:w="120" w:type="dxa"/>
+              <w:bottom w:w="90" w:type="dxa"/>
+              <w:end w:w="120" w:type="dxa"/>
+            </w:tcMar>
+            <w:vAlign w:val="center"/>
+          </w:tcPr>
+          <w:p>
+            <w:pPr>
+              <w:spacing w:after="0"/>
+            </w:pPr>
+            <w:r>
+              <w:rPr>
+                <w:rFonts w:ascii="Arial" w:hAnsi="Arial"/>
+                <w:sz w:val="18"/>
+              </w:rPr>
+              <w:t>Equipamento ou item de TI cadastrado no inventário do GLPI (computador, impressora, monitor, roteador, etc.).</w:t>
+            </w:r>
+          </w:p>
+        </w:tc>
+      </w:tr>
+      <w:tr>
+        <w:tc>
+          <w:tcPr>
+            <w:tcW w:type="dxa" w:w="2600"/>
+            <w:tcMar>
+              <w:top w:w="90" w:type="dxa"/>
+              <w:start w:w="120" w:type="dxa"/>
+              <w:bottom w:w="90" w:type="dxa"/>
+              <w:end w:w="120" w:type="dxa"/>
+            </w:tcMar>
+            <w:vAlign w:val="center"/>
+          </w:tcPr>
+          <w:p>
+            <w:pPr>
+              <w:spacing w:after="0"/>
+            </w:pPr>
+            <w:r>
+              <w:rPr>
+                <w:rFonts w:ascii="Arial" w:hAnsi="Arial"/>
+                <w:sz w:val="18"/>
+              </w:rPr>
+              <w:t>Chamado</w:t>
+            </w:r>
+          </w:p>
+        </w:tc>
+        <w:tc>
+          <w:tcPr>
+            <w:tcW w:type="dxa" w:w="6760"/>
+            <w:tcMar>
+              <w:top w:w="90" w:type="dxa"/>
+              <w:start w:w="120" w:type="dxa"/>
+              <w:bottom w:w="90" w:type="dxa"/>
+              <w:end w:w="120" w:type="dxa"/>
+            </w:tcMar>
+            <w:vAlign w:val="center"/>
+          </w:tcPr>
+          <w:p>
+            <w:pPr>
+              <w:spacing w:after="0"/>
+            </w:pPr>
+            <w:r>
+              <w:rPr>
+                <w:rFonts w:ascii="Arial" w:hAnsi="Arial"/>
+                <w:sz w:val="18"/>
+              </w:rPr>
+              <w:t>Registro de solicitação, incidente ou requisição aberto no GLPI.</w:t>
+            </w:r>
+          </w:p>
+        </w:tc>
+      </w:tr>
+      <w:tr>
+        <w:tc>
+          <w:tcPr>
+            <w:tcW w:type="dxa" w:w="2600"/>
+            <w:tcMar>
+              <w:top w:w="90" w:type="dxa"/>
+              <w:start w:w="120" w:type="dxa"/>
+              <w:bottom w:w="90" w:type="dxa"/>
+              <w:end w:w="120" w:type="dxa"/>
+            </w:tcMar>
+            <w:vAlign w:val="center"/>
+          </w:tcPr>
+          <w:p>
+            <w:pPr>
+              <w:spacing w:after="0"/>
+            </w:pPr>
+            <w:r>
+              <w:rPr>
+                <w:rFonts w:ascii="Arial" w:hAnsi="Arial"/>
+                <w:sz w:val="18"/>
+              </w:rPr>
+              <w:t>Patrimônio</w:t>
+            </w:r>
+          </w:p>
+        </w:tc>
+        <w:tc>
+          <w:tcPr>
+            <w:tcW w:type="dxa" w:w="6760"/>
+            <w:tcMar>
+              <w:top w:w="90" w:type="dxa"/>
+              <w:start w:w="120" w:type="dxa"/>
+              <w:bottom w:w="90" w:type="dxa"/>
+              <w:end w:w="120" w:type="dxa"/>
+            </w:tcMar>
+            <w:vAlign w:val="center"/>
+          </w:tcPr>
+          <w:p>
+            <w:pPr>
+              <w:spacing w:after="0"/>
+            </w:pPr>
+            <w:r>
+              <w:rPr>
+                <w:rFonts w:ascii="Arial" w:hAnsi="Arial"/>
+                <w:sz w:val="18"/>
+              </w:rPr>
+              <w:t>Setor responsável pelo controle patrimonial dos bens da Secretaria de Saúde do Recife.</w:t>
+            </w:r>
+          </w:p>
+        </w:tc>
+      </w:tr>
+      <w:tr>
+        <w:tc>
+          <w:tcPr>
+            <w:tcW w:type="dxa" w:w="2600"/>
+            <w:tcMar>
+              <w:top w:w="90" w:type="dxa"/>
+              <w:start w:w="120" w:type="dxa"/>
+              <w:bottom w:w="90" w:type="dxa"/>
+              <w:end w:w="120" w:type="dxa"/>
+            </w:tcMar>
+            <w:vAlign w:val="center"/>
+          </w:tcPr>
+          <w:p>
+            <w:pPr>
+              <w:spacing w:after="0"/>
+            </w:pPr>
+            <w:r>
+              <w:rPr>
+                <w:rFonts w:ascii="Arial" w:hAnsi="Arial"/>
+                <w:sz w:val="18"/>
+              </w:rPr>
+              <w:t>Ciclo de vida do ativo</w:t>
+            </w:r>
+          </w:p>
+        </w:tc>
+        <w:tc>
+          <w:tcPr>
+            <w:tcW w:type="dxa" w:w="6760"/>
+            <w:tcMar>
+              <w:top w:w="90" w:type="dxa"/>
+              <w:start w:w="120" w:type="dxa"/>
+              <w:bottom w:w="90" w:type="dxa"/>
+              <w:end w:w="120" w:type="dxa"/>
+            </w:tcMar>
+            <w:vAlign w:val="center"/>
+          </w:tcPr>
+          <w:p>
+            <w:pPr>
+              <w:spacing w:after="0"/>
+            </w:pPr>
+            <w:r>
+              <w:rPr>
+                <w:rFonts w:ascii="Arial" w:hAnsi="Arial"/>
+                <w:sz w:val="18"/>
+              </w:rPr>
+              <w:t>Conjunto de status que um ativo percorre ao longo de sua existência: Em uso → Em manutenção → Condenado / Baixado.</w:t>
+            </w:r>
+          </w:p>
+        </w:tc>
+      </w:tr>
+      <w:tr>
+        <w:tc>
+          <w:tcPr>
+            <w:tcW w:type="dxa" w:w="2600"/>
+            <w:tcMar>
+              <w:top w:w="90" w:type="dxa"/>
+              <w:start w:w="120" w:type="dxa"/>
+              <w:bottom w:w="90" w:type="dxa"/>
+              <w:end w:w="120" w:type="dxa"/>
+            </w:tcMar>
+            <w:vAlign w:val="center"/>
+          </w:tcPr>
+          <w:p>
+            <w:pPr>
+              <w:spacing w:after="0"/>
+            </w:pPr>
+            <w:r>
+              <w:rPr>
+                <w:rFonts w:ascii="Arial" w:hAnsi="Arial"/>
+                <w:sz w:val="18"/>
+              </w:rPr>
+              <w:t>Condenado</w:t>
+            </w:r>
+          </w:p>
+        </w:tc>
+        <w:tc>
+          <w:tcPr>
+            <w:tcW w:type="dxa" w:w="6760"/>
+            <w:tcMar>
+              <w:top w:w="90" w:type="dxa"/>
+              <w:start w:w="120" w:type="dxa"/>
+              <w:bottom w:w="90" w:type="dxa"/>
+              <w:end w:w="120" w:type="dxa"/>
+            </w:tcMar>
+            <w:vAlign w:val="center"/>
+          </w:tcPr>
+          <w:p>
+            <w:pPr>
+              <w:spacing w:after="0"/>
+            </w:pPr>
+            <w:r>
+              <w:rPr>
+                <w:rFonts w:ascii="Arial" w:hAnsi="Arial"/>
+                <w:sz w:val="18"/>
+              </w:rPr>
+              <w:t>Status do ativo quando está inoperante e aprovado formalmente para descarte ou baixa patrimonial.</w:t>
+            </w:r>
+          </w:p>
+        </w:tc>
+      </w:tr>
+      <w:tr>
+        <w:tc>
+          <w:tcPr>
+            <w:tcW w:type="dxa" w:w="2600"/>
+            <w:tcMar>
+              <w:top w:w="90" w:type="dxa"/>
+              <w:start w:w="120" w:type="dxa"/>
+              <w:bottom w:w="90" w:type="dxa"/>
+              <w:end w:w="120" w:type="dxa"/>
+            </w:tcMar>
+            <w:vAlign w:val="center"/>
+          </w:tcPr>
+          <w:p>
+            <w:pPr>
+              <w:spacing w:after="0"/>
+            </w:pPr>
+            <w:r>
+              <w:rPr>
+                <w:rFonts w:ascii="Arial" w:hAnsi="Arial"/>
+                <w:sz w:val="18"/>
+              </w:rPr>
+              <w:t>Central de Serviços</w:t>
+            </w:r>
+          </w:p>
+        </w:tc>
+        <w:tc>
+          <w:tcPr>
+            <w:tcW w:type="dxa" w:w="6760"/>
+            <w:tcMar>
+              <w:top w:w="90" w:type="dxa"/>
+              <w:start w:w="120" w:type="dxa"/>
+              <w:bottom w:w="90" w:type="dxa"/>
+              <w:end w:w="120" w:type="dxa"/>
+            </w:tcMar>
+            <w:vAlign w:val="center"/>
+          </w:tcPr>
+          <w:p>
+            <w:pPr>
+              <w:spacing w:after="0"/>
+            </w:pPr>
+            <w:r>
+              <w:rPr>
+                <w:rFonts w:ascii="Arial" w:hAnsi="Arial"/>
+                <w:sz w:val="18"/>
+              </w:rPr>
+              <w:t>Equipe responsável pela abertura de todos os chamados no GLPI (N1).</w:t>
+            </w:r>
+          </w:p>
+        </w:tc>
+      </w:tr>
+      <w:tr>
+        <w:tc>
+          <w:tcPr>
+            <w:tcW w:type="dxa" w:w="2600"/>
+            <w:tcMar>
+              <w:top w:w="90" w:type="dxa"/>
+              <w:start w:w="120" w:type="dxa"/>
+              <w:bottom w:w="90" w:type="dxa"/>
+              <w:end w:w="120" w:type="dxa"/>
+            </w:tcMar>
+            <w:vAlign w:val="center"/>
+          </w:tcPr>
+          <w:p>
+            <w:pPr>
+              <w:spacing w:after="0"/>
+            </w:pPr>
+            <w:r>
+              <w:rPr>
+                <w:rFonts w:ascii="Arial" w:hAnsi="Arial"/>
+                <w:sz w:val="18"/>
+              </w:rPr>
+              <w:t>N2</w:t>
+            </w:r>
+          </w:p>
+        </w:tc>
+        <w:tc>
+          <w:tcPr>
+            <w:tcW w:type="dxa" w:w="6760"/>
+            <w:tcMar>
+              <w:top w:w="90" w:type="dxa"/>
+              <w:start w:w="120" w:type="dxa"/>
+              <w:bottom w:w="90" w:type="dxa"/>
+              <w:end w:w="120" w:type="dxa"/>
+            </w:tcMar>
+            <w:vAlign w:val="center"/>
+          </w:tcPr>
+          <w:p>
+            <w:pPr>
+              <w:spacing w:after="0"/>
+            </w:pPr>
+            <w:r>
+              <w:rPr>
+                <w:rFonts w:ascii="Arial" w:hAnsi="Arial"/>
+                <w:sz w:val="18"/>
+              </w:rPr>
+              <w:t>Técnico de suporte de segundo nível, responsável pelo atendimento presencial ou remoto avançado.</w:t>
+            </w:r>
+          </w:p>
+        </w:tc>
+      </w:tr>
+    </w:tbl>
+    <w:p>
+      <w:pPr>
+        <w:spacing w:after="40"/>
+      </w:pPr>
+    </w:p>
+    <w:p>
+      <w:pPr>
+        <w:pStyle w:val="Heading1"/>
+      </w:pPr>
+      <w:r>
         <w:t>Tabela de Status dos Ativos Referência rápida</w:t>
       </w:r>
     </w:p>
@@ -4733,7 +4733,7 @@
         <w:pStyle w:val="Heading1"/>
       </w:pPr>
       <w:r>
-        <w:t>Histórico de Revisões</w:t>
+        <w:t>Histórico de Revisão</w:t>
       </w:r>
     </w:p>
     <w:tbl>

</xml_diff>